<commit_message>
docs: update BRD/SRS/SDD deliverables and supporting diagrams/scripts
Carries forward the prior BA working-session changes to project_data.py,
fill_brd.py, fill_srs.py, build_sdd.py and the regenerated .docx
deliverables/diagrams, and removes the superseded vibe-code guide
(HUONG_DAN_VIBE_CODE_BoardVerse.md) per the author's own edit.
</commit_message>
<xml_diff>
--- a/deliverables/BRD_BoardVerse_v1.0.docx
+++ b/deliverables/BRD_BoardVerse_v1.0.docx
@@ -1753,7 +1753,7 @@
                 <w:color w:val="222222"/>
                 <w:sz w:val="19"/>
               </w:rPr>
-              <w:t>Người dùng vai trò nhân viên kho/quầy.</w:t>
+              <w:t>Người dùng vai trò nhân viên kho/xử lý đơn hàng.</w:t>
             </w:r>
           </w:p>
         </w:tc>
@@ -2012,7 +2012,7 @@
           <w:color w:val="222222"/>
           <w:sz w:val="21"/>
         </w:rPr>
-        <w:t>Lợi ích kỳ vọng: giảm tỷ lệ thất lạc linh kiện xuống 5%, tăng tỷ trọng đơn thuê online lên 60%, giảm thời gian xử lý đơn xuống 3 phút, tăng 20% doanh thu cho thuê trong 12 tháng và loại bỏ khiếu nại sai lệch cọc (chi tiết Chương 4). Tổng chi phí đầu tư ước tính 78.600.000 VNĐ, chi phí vận hành khoảng 10.200.000 VNĐ/năm, thời gian hoàn vốn dự kiến khoảng 12,8 tháng (chi tiết Chương 9).</w:t>
+        <w:t>Lợi ích kỳ vọng: giảm tỷ lệ thất lạc linh kiện xuống 5%, tăng tỷ trọng đơn thuê khách tự đặt trực tiếp trên website lên 90%, giảm thời gian xử lý đơn xuống 3 phút, tăng 20% doanh thu cho thuê trong 12 tháng và loại bỏ khiếu nại sai lệch cọc (chi tiết Chương 4). Tổng chi phí đầu tư ước tính 78.600.000 VNĐ, chi phí vận hành khoảng 10.200.000 VNĐ/năm, thời gian hoàn vốn dự kiến khoảng 12,8 tháng (chi tiết Chương 9).</w:t>
       </w:r>
     </w:p>
     <w:p>
@@ -2087,7 +2087,7 @@
           <w:color w:val="222222"/>
           <w:sz w:val="21"/>
         </w:rPr>
-        <w:t>BoardVerse là một cửa hàng giả định chuyên mua bán và cho thuê board game tại Quận 1, TP. Hồ Chí Minh, hoạt động từ năm 2021. Cửa hàng có 1 địa điểm vật lý rộng 150m², khoảng 500 tựa board game trong kho (bao gồm cả bản bán và bản cho thuê), 8 nhân sự (2 quản lý quầy, 4 nhân viên kho/quầy, 1 kế toán, 1 quản lý vận hành) và phục vụ trung bình 300 lượt khách thuê/tháng, 120 đơn bán/tháng. Khách hàng chính là người chơi board game cá nhân, các nhóm/hội board game tổ chức sự kiện, và một số quán cà phê board game nhỏ thuê lại theo lô.</w:t>
+        <w:t>BoardVerse là một cửa hàng giả định chuyên mua bán và cho thuê board game, hoạt động hoàn toàn trực tuyến (không có cửa hàng/quầy bán vật lý cho khách), hoạt động từ năm 2021. Cửa hàng chỉ có 1 kho hàng nội bộ tại Quận 1, TP. Hồ Chí Minh (chỉ nhân viên ra vào, không tiếp khách trực tiếp), khoảng 500 tựa board game trong kho (bao gồm cả bản bán và bản cho thuê), 7 nhân sự (5 nhân viên kho/xử lý đơn hàng, 1 nhân viên hỗ trợ khách hàng trực tuyến, 1 quản lý vận hành) và phục vụ trung bình 300 lượt khách thuê/tháng, 120 đơn bán/tháng, toàn bộ qua website. Mọi đơn hàng/đơn thuê được giao đi và lấy về đều qua đối tác giao vận bên thứ ba (giả định) ở cả hai chiều, cửa hàng không tự vận chuyển. Khách hàng chính là người chơi board game cá nhân, các nhóm/hội board game tổ chức sự kiện, và một số quán cà phê board game nhỏ thuê lại theo lô.</w:t>
       </w:r>
     </w:p>
     <w:p>
@@ -2147,7 +2147,7 @@
           <w:color w:val="222222"/>
           <w:sz w:val="21"/>
         </w:rPr>
-        <w:t>Quy trình thuê/trả board game hiện tại gồm các bước thủ công từ lúc khách hỏi tình trạng sản phẩm đến lúc hoàn cọc, được mô tả tại Hình 3.1 (mã PlantUML, tác giả tự vẽ lại bằng draw.io).</w:t>
+        <w:t>Quy trình thuê/trả board game hiện tại gồm các bước thủ công từ lúc khách hỏi tình trạng sản phẩm đến lúc hoàn cọc; toàn bộ giao dịch diễn ra qua điện thoại/Zalo và giao nhận tại nhà khách (cửa hàng không có quầy tiếp khách trực tiếp), được mô tả tại Hình 3.1 (mã PlantUML, tác giả tự vẽ lại bằng draw.io).</w:t>
       </w:r>
     </w:p>
     <w:p>
@@ -2251,7 +2251,7 @@
           <w:color w:val="1B1B1B"/>
           <w:sz w:val="19"/>
         </w:rPr>
-        <w:t xml:space="preserve">  :Khách đến quầy, chọn game, nộp cọc tiền mặt;</w:t>
+        <w:t xml:space="preserve">  :Nhân viên ghi tay thông tin thuê, hẹn người quen/xe ôm mang game đến giao cho khách;</w:t>
         <w:br/>
       </w:r>
       <w:r>
@@ -2273,6 +2273,17 @@
           <w:color w:val="1B1B1B"/>
           <w:sz w:val="19"/>
         </w:rPr>
+        <w:t>:Khách chuyển khoản/đưa tiền mặt cọc cho người giao hàng, không có mã tra cứu;</w:t>
+        <w:br/>
+      </w:r>
+      <w:r>
+        <w:rPr>
+          <w:rFonts w:ascii="Consolas" w:hAnsi="Consolas"/>
+          <w:b w:val="0"/>
+          <w:i w:val="0"/>
+          <w:color w:val="1B1B1B"/>
+          <w:sz w:val="19"/>
+        </w:rPr>
         <w:t>:Nhân viên ghi tay thông tin thuê và số cọc vào sổ;</w:t>
         <w:br/>
       </w:r>
@@ -2284,7 +2295,7 @@
           <w:color w:val="1B1B1B"/>
           <w:sz w:val="19"/>
         </w:rPr>
-        <w:t>:Giao game cho khách, khách mang về sử dụng;</w:t>
+        <w:t>:Khách sử dụng game tại nhà;</w:t>
         <w:br/>
       </w:r>
       <w:r>
@@ -2295,7 +2306,7 @@
           <w:color w:val="1B1B1B"/>
           <w:sz w:val="19"/>
         </w:rPr>
-        <w:t>:Khách mang trả game đúng/trễ hạn;</w:t>
+        <w:t>:Đến hạn, nhân viên hẹn người mang đi lấy lại game đúng/trễ hạn;</w:t>
         <w:br/>
       </w:r>
       <w:r>
@@ -2361,7 +2372,7 @@
           <w:color w:val="1B1B1B"/>
           <w:sz w:val="19"/>
         </w:rPr>
-        <w:t>:Hoàn cọc còn lại bằng tiền mặt, không có phiếu xác nhận;</w:t>
+        <w:t>:Hoàn cọc còn lại bằng chuyển khoản/tiền mặt, không có phiếu xác nhận;</w:t>
         <w:br/>
       </w:r>
       <w:r>
@@ -2837,7 +2848,7 @@
                 <w:color w:val="222222"/>
                 <w:sz w:val="19"/>
               </w:rPr>
-              <w:t>Nhân viên quầy không biết sản phẩm đã được giữ chỗ bởi đơn khác, dẫn đến hẹn khách rồi huỷ, trung bình 5 lượt/tháng.</w:t>
+              <w:t>Nhân viên xử lý đơn không biết sản phẩm đã được giữ chỗ bởi đơn khác, dẫn đến hẹn khách rồi huỷ, trung bình 5 lượt/tháng.</w:t>
             </w:r>
           </w:p>
         </w:tc>
@@ -3737,7 +3748,7 @@
                 <w:color w:val="222222"/>
                 <w:sz w:val="19"/>
               </w:rPr>
-              <w:t>Tăng tỷ trọng đơn thuê được đặt qua kênh online (web) từ 0% lên 60% tổng số đơn thuê, trong vòng 6 tháng kể từ go-live.</w:t>
+              <w:t>Tăng tỷ trọng đơn thuê khách tự đặt trực tiếp trên website (không cần nhân viên ghi nhận hộ qua điện thoại/Zalo) từ 0% lên 90% tổng số đơn thuê, trong vòng 6 tháng kể từ go-live.</w:t>
             </w:r>
           </w:p>
         </w:tc>
@@ -3817,7 +3828,7 @@
                 <w:color w:val="222222"/>
                 <w:sz w:val="19"/>
               </w:rPr>
-              <w:t>Giảm thời gian xử lý trung bình 1 đơn thuê tại quầy từ 15 phút xuống còn 3 phút, trong vòng 3 tháng kể từ go-live.</w:t>
+              <w:t>Giảm thời gian xử lý trung bình 1 đơn thuê (từ lúc khách đặt đến lúc nhân viên xác nhận) từ 15 phút xuống còn 3 phút, trong vòng 3 tháng kể từ go-live.</w:t>
             </w:r>
           </w:p>
         </w:tc>
@@ -3897,7 +3908,7 @@
                 <w:color w:val="222222"/>
                 <w:sz w:val="19"/>
               </w:rPr>
-              <w:t>Tăng doanh thu cho thuê 20% so với cùng kỳ năm trước, trong vòng 12 tháng kể từ go-live, nhờ mở rộng kênh đặt online.</w:t>
+              <w:t>Tăng doanh thu cho thuê 20% so với cùng kỳ năm trước, trong vòng 12 tháng kể từ go-live, nhờ tự động hoá quy trình đặt thuê và mở rộng phạm vi giao vận ra ngoài bán kính 20km.</w:t>
             </w:r>
           </w:p>
         </w:tc>
@@ -4424,7 +4435,7 @@
                 <w:color w:val="222222"/>
                 <w:sz w:val="19"/>
               </w:rPr>
-              <w:t>Tỷ trọng đơn thuê đặt qua kênh online</w:t>
+              <w:t>Tỷ trọng đơn thuê khách tự đặt trực tiếp trên website</w:t>
             </w:r>
           </w:p>
         </w:tc>
@@ -4476,7 +4487,7 @@
                 <w:color w:val="222222"/>
                 <w:sz w:val="19"/>
               </w:rPr>
-              <w:t>≥ 60%</w:t>
+              <w:t>≥ 90%</w:t>
             </w:r>
           </w:p>
         </w:tc>
@@ -4502,7 +4513,7 @@
                 <w:color w:val="222222"/>
                 <w:sz w:val="19"/>
               </w:rPr>
-              <w:t>Số đơn thuê có nguồn = 'Online' ÷ tổng số đơn thuê</w:t>
+              <w:t>Số đơn thuê khách tự tạo trên website ÷ tổng số đơn thuê (phần còn lại do nhân viên hỗ trợ trực tuyến tạo hộ qua điện thoại/chat)</w:t>
             </w:r>
           </w:p>
         </w:tc>
@@ -4582,7 +4593,7 @@
                 <w:color w:val="222222"/>
                 <w:sz w:val="19"/>
               </w:rPr>
-              <w:t>Thời gian xử lý trung bình 1 đơn thuê tại quầy</w:t>
+              <w:t>Thời gian xử lý trung bình 1 đơn thuê</w:t>
             </w:r>
           </w:p>
         </w:tc>
@@ -4660,7 +4671,7 @@
                 <w:color w:val="222222"/>
                 <w:sz w:val="19"/>
               </w:rPr>
-              <w:t>Thời điểm xác nhận đơn trừ thời điểm bắt đầu tạo đơn trên hệ thống POS</w:t>
+              <w:t>Thời điểm nhân viên xác nhận đơn trừ thời điểm khách tạo đơn trên hệ thống</w:t>
             </w:r>
           </w:p>
         </w:tc>
@@ -5111,7 +5122,7 @@
           <w:color w:val="222222"/>
           <w:sz w:val="21"/>
         </w:rPr>
-        <w:t>☐ Đạt mục tiêu BO-02: Tăng tỷ trọng đơn thuê được đặt qua kênh online (web) từ 0% lên 60% tổng số đơn thuê... (Đạt/Không đạt).</w:t>
+        <w:t>☐ Đạt mục tiêu BO-02: Tăng tỷ trọng đơn thuê khách tự đặt trực tiếp trên website (không cần nhân viên ghi nhận hộ qua điện thoại/Zalo) từ 0% lên 90% tổng số đơn thuê... (Đạt/Không đạt).</w:t>
       </w:r>
     </w:p>
     <w:p>
@@ -5126,7 +5137,7 @@
           <w:color w:val="222222"/>
           <w:sz w:val="21"/>
         </w:rPr>
-        <w:t>☐ Đạt mục tiêu BO-03: Giảm thời gian xử lý trung bình 1 đơn thuê tại quầy từ 15 phút xuống còn 3 phút... (Đạt/Không đạt).</w:t>
+        <w:t>☐ Đạt mục tiêu BO-03: Giảm thời gian xử lý trung bình 1 đơn thuê (từ lúc khách đặt đến lúc nhân viên xác nhận) từ 15 phút xuống còn 3 phút... (Đạt/Không đạt).</w:t>
       </w:r>
     </w:p>
     <w:p>
@@ -5379,7 +5390,7 @@
                 <w:color w:val="222222"/>
                 <w:sz w:val="19"/>
               </w:rPr>
-              <w:t>Bán board game trực tuyến và tại quầy (tạo đơn, thanh toán, xuất hoá đơn nội bộ).</w:t>
+              <w:t>Bán board game trực tuyến 100% trên website (tạo đơn, thanh toán, xuất hoá đơn nội bộ), không có kênh bán tại quầy/cửa hàng vật lý.</w:t>
             </w:r>
           </w:p>
         </w:tc>
@@ -5595,7 +5606,7 @@
                 <w:color w:val="222222"/>
                 <w:sz w:val="19"/>
               </w:rPr>
-              <w:t>Quản lý khách hàng (đăng ký, đăng nhập, lịch sử đơn mua/thuê).</w:t>
+              <w:t>Quản lý khách hàng (đăng ký, đăng nhập, sửa thông tin cá nhân, lịch sử đơn mua/thuê).</w:t>
             </w:r>
           </w:p>
         </w:tc>
@@ -5649,7 +5660,7 @@
                 <w:color w:val="222222"/>
                 <w:sz w:val="19"/>
               </w:rPr>
-              <w:t>Báo cáo doanh thu cơ bản theo ngày/tháng cho Admin.</w:t>
+              <w:t>Báo cáo doanh thu và vận hành (tồn kho, trạng thái đơn) cơ bản theo ngày/tháng cho Admin.</w:t>
             </w:r>
           </w:p>
         </w:tc>
@@ -5703,7 +5714,7 @@
                 <w:color w:val="222222"/>
                 <w:sz w:val="19"/>
               </w:rPr>
-              <w:t>Giao vận hai chiều (nhận hàng và trả hàng) thông qua tích hợp đối tác giao vận bên thứ ba, tính phí theo khu vực.</w:t>
+              <w:t>Giao vận hai chiều bắt buộc (nhận hàng và trả hàng đều qua đối tác giao vận, không có hình thức tự đến lấy/tự mang trả), tự động chọn đối tác và tính phí theo khoảng cách giao nhận.</w:t>
             </w:r>
           </w:p>
         </w:tc>
@@ -5757,7 +5768,115 @@
                 <w:color w:val="222222"/>
                 <w:sz w:val="19"/>
               </w:rPr>
-              <w:t>Thanh toán trực tuyến qua mã QR (ví điện tử/tài khoản ngân hàng) thông qua cổng thanh toán, áp dụng cho tiền hàng/tiền cọc/tiền thuê.</w:t>
+              <w:t>Thanh toán trực tuyến qua mã QR (ví điện tử/tài khoản ngân hàng) thông qua cổng thanh toán, áp dụng cho tiền hàng/tiền cọc/tiền thuê; hoàn tiền vào ví điện tử nội bộ trên hệ thống, khách có thể rút về tài khoản ngân hàng của mình.</w:t>
+            </w:r>
+          </w:p>
+        </w:tc>
+      </w:tr>
+      <w:tr>
+        <w:tc>
+          <w:tcPr>
+            <w:tcW w:type="dxa" w:w="1134"/>
+            <w:shd w:val="clear" w:color="auto" w:fill="EEF2F7"/>
+            <w:tcBorders>
+              <w:top w:val="single" w:sz="4" w:space="0" w:color="B9C4D4"/>
+              <w:left w:val="single" w:sz="4" w:space="0" w:color="B9C4D4"/>
+              <w:bottom w:val="single" w:sz="4" w:space="0" w:color="B9C4D4"/>
+              <w:right w:val="single" w:sz="4" w:space="0" w:color="B9C4D4"/>
+            </w:tcBorders>
+            <w:vAlign w:val="center"/>
+          </w:tcPr>
+          <w:p>
+            <w:r/>
+            <w:r>
+              <w:rPr>
+                <w:rFonts w:ascii="Calibri" w:hAnsi="Calibri"/>
+                <w:b/>
+                <w:i w:val="0"/>
+                <w:color w:val="1B365D"/>
+                <w:sz w:val="19"/>
+              </w:rPr>
+              <w:t>SC-10</w:t>
+            </w:r>
+          </w:p>
+        </w:tc>
+        <w:tc>
+          <w:tcPr>
+            <w:tcW w:type="dxa" w:w="7370"/>
+            <w:shd w:val="clear" w:color="auto" w:fill="EEF2F7"/>
+            <w:tcBorders>
+              <w:top w:val="single" w:sz="4" w:space="0" w:color="B9C4D4"/>
+              <w:left w:val="single" w:sz="4" w:space="0" w:color="B9C4D4"/>
+              <w:bottom w:val="single" w:sz="4" w:space="0" w:color="B9C4D4"/>
+              <w:right w:val="single" w:sz="4" w:space="0" w:color="B9C4D4"/>
+            </w:tcBorders>
+            <w:vAlign w:val="center"/>
+          </w:tcPr>
+          <w:p>
+            <w:r/>
+            <w:r>
+              <w:rPr>
+                <w:rFonts w:ascii="Calibri" w:hAnsi="Calibri"/>
+                <w:b w:val="0"/>
+                <w:i w:val="0"/>
+                <w:color w:val="222222"/>
+                <w:sz w:val="19"/>
+              </w:rPr>
+              <w:t>Quản lý tài khoản nội bộ (Staff/Admin): đăng nhập riêng biệt với khách hàng, Admin tạo/sửa/khoá tài khoản nhân viên.</w:t>
+            </w:r>
+          </w:p>
+        </w:tc>
+      </w:tr>
+      <w:tr>
+        <w:tc>
+          <w:tcPr>
+            <w:tcW w:type="dxa" w:w="1134"/>
+            <w:shd w:val="clear" w:color="auto" w:fill="FFFFFF"/>
+            <w:tcBorders>
+              <w:top w:val="single" w:sz="4" w:space="0" w:color="B9C4D4"/>
+              <w:left w:val="single" w:sz="4" w:space="0" w:color="B9C4D4"/>
+              <w:bottom w:val="single" w:sz="4" w:space="0" w:color="B9C4D4"/>
+              <w:right w:val="single" w:sz="4" w:space="0" w:color="B9C4D4"/>
+            </w:tcBorders>
+            <w:vAlign w:val="center"/>
+          </w:tcPr>
+          <w:p>
+            <w:r/>
+            <w:r>
+              <w:rPr>
+                <w:rFonts w:ascii="Calibri" w:hAnsi="Calibri"/>
+                <w:b/>
+                <w:i w:val="0"/>
+                <w:color w:val="1B365D"/>
+                <w:sz w:val="19"/>
+              </w:rPr>
+              <w:t>SC-11</w:t>
+            </w:r>
+          </w:p>
+        </w:tc>
+        <w:tc>
+          <w:tcPr>
+            <w:tcW w:type="dxa" w:w="7370"/>
+            <w:shd w:val="clear" w:color="auto" w:fill="FFFFFF"/>
+            <w:tcBorders>
+              <w:top w:val="single" w:sz="4" w:space="0" w:color="B9C4D4"/>
+              <w:left w:val="single" w:sz="4" w:space="0" w:color="B9C4D4"/>
+              <w:bottom w:val="single" w:sz="4" w:space="0" w:color="B9C4D4"/>
+              <w:right w:val="single" w:sz="4" w:space="0" w:color="B9C4D4"/>
+            </w:tcBorders>
+            <w:vAlign w:val="center"/>
+          </w:tcPr>
+          <w:p>
+            <w:r/>
+            <w:r>
+              <w:rPr>
+                <w:rFonts w:ascii="Calibri" w:hAnsi="Calibri"/>
+                <w:b w:val="0"/>
+                <w:i w:val="0"/>
+                <w:color w:val="222222"/>
+                <w:sz w:val="19"/>
+              </w:rPr>
+              <w:t>Đánh giá sản phẩm: khách để lại số điểm (sao) và nhận xét cho sản phẩm đã mua/thuê, hiển thị điểm trung bình và danh sách nhận xét trên trang chi tiết sản phẩm.</w:t>
             </w:r>
           </w:p>
         </w:tc>
@@ -5956,7 +6075,7 @@
                 <w:color w:val="222222"/>
                 <w:sz w:val="19"/>
               </w:rPr>
-              <w:t>Hệ thống chỉ tích hợp với đối tác giao vận bên thứ ba Green SM (giả định) qua API để tạo yêu cầu giao/lấy hàng, không tuyển dụng hoặc quản lý nhân sự giao hàng riêng.</w:t>
+              <w:t>Hệ thống chỉ tích hợp với các đối tác giao vận bên thứ ba (Green SM, Shopee Express — giả định) qua API để tạo yêu cầu giao/lấy hàng, không tuyển dụng hoặc quản lý nhân sự giao hàng riêng.</w:t>
             </w:r>
           </w:p>
         </w:tc>
@@ -6277,6 +6396,326 @@
                 <w:sz w:val="19"/>
               </w:rPr>
               <w:t>Chỉ xây dựng web responsive dùng tốt trên cả máy tính và di động, không phát triển app iOS/Android riêng trong phạm vi đồ án.</w:t>
+            </w:r>
+          </w:p>
+        </w:tc>
+      </w:tr>
+      <w:tr>
+        <w:tc>
+          <w:tcPr>
+            <w:tcW w:type="dxa" w:w="1020"/>
+            <w:shd w:val="clear" w:color="auto" w:fill="EEF2F7"/>
+            <w:tcBorders>
+              <w:top w:val="single" w:sz="4" w:space="0" w:color="B9C4D4"/>
+              <w:left w:val="single" w:sz="4" w:space="0" w:color="B9C4D4"/>
+              <w:bottom w:val="single" w:sz="4" w:space="0" w:color="B9C4D4"/>
+              <w:right w:val="single" w:sz="4" w:space="0" w:color="B9C4D4"/>
+            </w:tcBorders>
+            <w:vAlign w:val="center"/>
+          </w:tcPr>
+          <w:p>
+            <w:r/>
+            <w:r>
+              <w:rPr>
+                <w:rFonts w:ascii="Calibri" w:hAnsi="Calibri"/>
+                <w:b/>
+                <w:i w:val="0"/>
+                <w:color w:val="1B365D"/>
+                <w:sz w:val="19"/>
+              </w:rPr>
+              <w:t>OS-06</w:t>
+            </w:r>
+          </w:p>
+        </w:tc>
+        <w:tc>
+          <w:tcPr>
+            <w:tcW w:type="dxa" w:w="2835"/>
+            <w:shd w:val="clear" w:color="auto" w:fill="EEF2F7"/>
+            <w:tcBorders>
+              <w:top w:val="single" w:sz="4" w:space="0" w:color="B9C4D4"/>
+              <w:left w:val="single" w:sz="4" w:space="0" w:color="B9C4D4"/>
+              <w:bottom w:val="single" w:sz="4" w:space="0" w:color="B9C4D4"/>
+              <w:right w:val="single" w:sz="4" w:space="0" w:color="B9C4D4"/>
+            </w:tcBorders>
+            <w:vAlign w:val="center"/>
+          </w:tcPr>
+          <w:p>
+            <w:r/>
+            <w:r>
+              <w:rPr>
+                <w:rFonts w:ascii="Calibri" w:hAnsi="Calibri"/>
+                <w:b w:val="0"/>
+                <w:i w:val="0"/>
+                <w:color w:val="222222"/>
+                <w:sz w:val="19"/>
+              </w:rPr>
+              <w:t>Mã giảm giá / voucher khuyến mãi</w:t>
+            </w:r>
+          </w:p>
+        </w:tc>
+        <w:tc>
+          <w:tcPr>
+            <w:tcW w:type="dxa" w:w="4649"/>
+            <w:shd w:val="clear" w:color="auto" w:fill="EEF2F7"/>
+            <w:tcBorders>
+              <w:top w:val="single" w:sz="4" w:space="0" w:color="B9C4D4"/>
+              <w:left w:val="single" w:sz="4" w:space="0" w:color="B9C4D4"/>
+              <w:bottom w:val="single" w:sz="4" w:space="0" w:color="B9C4D4"/>
+              <w:right w:val="single" w:sz="4" w:space="0" w:color="B9C4D4"/>
+            </w:tcBorders>
+            <w:vAlign w:val="center"/>
+          </w:tcPr>
+          <w:p>
+            <w:r/>
+            <w:r>
+              <w:rPr>
+                <w:rFonts w:ascii="Calibri" w:hAnsi="Calibri"/>
+                <w:b w:val="0"/>
+                <w:i w:val="0"/>
+                <w:color w:val="222222"/>
+                <w:sz w:val="19"/>
+              </w:rPr>
+              <w:t>Chủ đầu tư chưa có nhu cầu triển khai chương trình khuyến mãi ở phiên bản đầu; có thể bổ sung ở phiên bản sau.</w:t>
+            </w:r>
+          </w:p>
+        </w:tc>
+      </w:tr>
+      <w:tr>
+        <w:tc>
+          <w:tcPr>
+            <w:tcW w:type="dxa" w:w="1020"/>
+            <w:shd w:val="clear" w:color="auto" w:fill="FFFFFF"/>
+            <w:tcBorders>
+              <w:top w:val="single" w:sz="4" w:space="0" w:color="B9C4D4"/>
+              <w:left w:val="single" w:sz="4" w:space="0" w:color="B9C4D4"/>
+              <w:bottom w:val="single" w:sz="4" w:space="0" w:color="B9C4D4"/>
+              <w:right w:val="single" w:sz="4" w:space="0" w:color="B9C4D4"/>
+            </w:tcBorders>
+            <w:vAlign w:val="center"/>
+          </w:tcPr>
+          <w:p>
+            <w:r/>
+            <w:r>
+              <w:rPr>
+                <w:rFonts w:ascii="Calibri" w:hAnsi="Calibri"/>
+                <w:b/>
+                <w:i w:val="0"/>
+                <w:color w:val="1B365D"/>
+                <w:sz w:val="19"/>
+              </w:rPr>
+              <w:t>OS-07</w:t>
+            </w:r>
+          </w:p>
+        </w:tc>
+        <w:tc>
+          <w:tcPr>
+            <w:tcW w:type="dxa" w:w="2835"/>
+            <w:shd w:val="clear" w:color="auto" w:fill="FFFFFF"/>
+            <w:tcBorders>
+              <w:top w:val="single" w:sz="4" w:space="0" w:color="B9C4D4"/>
+              <w:left w:val="single" w:sz="4" w:space="0" w:color="B9C4D4"/>
+              <w:bottom w:val="single" w:sz="4" w:space="0" w:color="B9C4D4"/>
+              <w:right w:val="single" w:sz="4" w:space="0" w:color="B9C4D4"/>
+            </w:tcBorders>
+            <w:vAlign w:val="center"/>
+          </w:tcPr>
+          <w:p>
+            <w:r/>
+            <w:r>
+              <w:rPr>
+                <w:rFonts w:ascii="Calibri" w:hAnsi="Calibri"/>
+                <w:b w:val="0"/>
+                <w:i w:val="0"/>
+                <w:color w:val="222222"/>
+                <w:sz w:val="19"/>
+              </w:rPr>
+              <w:t>Đổi/trả hàng cho đơn mua đã giao thành công</w:t>
+            </w:r>
+          </w:p>
+        </w:tc>
+        <w:tc>
+          <w:tcPr>
+            <w:tcW w:type="dxa" w:w="4649"/>
+            <w:shd w:val="clear" w:color="auto" w:fill="FFFFFF"/>
+            <w:tcBorders>
+              <w:top w:val="single" w:sz="4" w:space="0" w:color="B9C4D4"/>
+              <w:left w:val="single" w:sz="4" w:space="0" w:color="B9C4D4"/>
+              <w:bottom w:val="single" w:sz="4" w:space="0" w:color="B9C4D4"/>
+              <w:right w:val="single" w:sz="4" w:space="0" w:color="B9C4D4"/>
+            </w:tcBorders>
+            <w:vAlign w:val="center"/>
+          </w:tcPr>
+          <w:p>
+            <w:r/>
+            <w:r>
+              <w:rPr>
+                <w:rFonts w:ascii="Calibri" w:hAnsi="Calibri"/>
+                <w:b w:val="0"/>
+                <w:i w:val="0"/>
+                <w:color w:val="222222"/>
+                <w:sz w:val="19"/>
+              </w:rPr>
+              <w:t>Ngoài phạm vi đồ án cá nhân; chỉ xử lý khiếu nại hư hỏng/thiếu linh kiện cho đơn thuê (BRU-04), không có quy trình đổi/trả hàng mua.</w:t>
+            </w:r>
+          </w:p>
+        </w:tc>
+      </w:tr>
+      <w:tr>
+        <w:tc>
+          <w:tcPr>
+            <w:tcW w:type="dxa" w:w="1020"/>
+            <w:shd w:val="clear" w:color="auto" w:fill="EEF2F7"/>
+            <w:tcBorders>
+              <w:top w:val="single" w:sz="4" w:space="0" w:color="B9C4D4"/>
+              <w:left w:val="single" w:sz="4" w:space="0" w:color="B9C4D4"/>
+              <w:bottom w:val="single" w:sz="4" w:space="0" w:color="B9C4D4"/>
+              <w:right w:val="single" w:sz="4" w:space="0" w:color="B9C4D4"/>
+            </w:tcBorders>
+            <w:vAlign w:val="center"/>
+          </w:tcPr>
+          <w:p>
+            <w:r/>
+            <w:r>
+              <w:rPr>
+                <w:rFonts w:ascii="Calibri" w:hAnsi="Calibri"/>
+                <w:b/>
+                <w:i w:val="0"/>
+                <w:color w:val="1B365D"/>
+                <w:sz w:val="19"/>
+              </w:rPr>
+              <w:t>OS-08</w:t>
+            </w:r>
+          </w:p>
+        </w:tc>
+        <w:tc>
+          <w:tcPr>
+            <w:tcW w:type="dxa" w:w="2835"/>
+            <w:shd w:val="clear" w:color="auto" w:fill="EEF2F7"/>
+            <w:tcBorders>
+              <w:top w:val="single" w:sz="4" w:space="0" w:color="B9C4D4"/>
+              <w:left w:val="single" w:sz="4" w:space="0" w:color="B9C4D4"/>
+              <w:bottom w:val="single" w:sz="4" w:space="0" w:color="B9C4D4"/>
+              <w:right w:val="single" w:sz="4" w:space="0" w:color="B9C4D4"/>
+            </w:tcBorders>
+            <w:vAlign w:val="center"/>
+          </w:tcPr>
+          <w:p>
+            <w:r/>
+            <w:r>
+              <w:rPr>
+                <w:rFonts w:ascii="Calibri" w:hAnsi="Calibri"/>
+                <w:b w:val="0"/>
+                <w:i w:val="0"/>
+                <w:color w:val="222222"/>
+                <w:sz w:val="19"/>
+              </w:rPr>
+              <w:t>Vai trò Kế toán riêng trong hệ thống</w:t>
+            </w:r>
+          </w:p>
+        </w:tc>
+        <w:tc>
+          <w:tcPr>
+            <w:tcW w:type="dxa" w:w="4649"/>
+            <w:shd w:val="clear" w:color="auto" w:fill="EEF2F7"/>
+            <w:tcBorders>
+              <w:top w:val="single" w:sz="4" w:space="0" w:color="B9C4D4"/>
+              <w:left w:val="single" w:sz="4" w:space="0" w:color="B9C4D4"/>
+              <w:bottom w:val="single" w:sz="4" w:space="0" w:color="B9C4D4"/>
+              <w:right w:val="single" w:sz="4" w:space="0" w:color="B9C4D4"/>
+            </w:tcBorders>
+            <w:vAlign w:val="center"/>
+          </w:tcPr>
+          <w:p>
+            <w:r/>
+            <w:r>
+              <w:rPr>
+                <w:rFonts w:ascii="Calibri" w:hAnsi="Calibri"/>
+                <w:b w:val="0"/>
+                <w:i w:val="0"/>
+                <w:color w:val="222222"/>
+                <w:sz w:val="19"/>
+              </w:rPr>
+              <w:t>Số liệu tài chính/báo cáo doanh thu phục vụ kế toán được Admin xem và xuất trực tiếp (BR-07, BR-13); không xây riêng tài khoản/phân hệ cho vai trò Kế toán.</w:t>
+            </w:r>
+          </w:p>
+        </w:tc>
+      </w:tr>
+      <w:tr>
+        <w:tc>
+          <w:tcPr>
+            <w:tcW w:type="dxa" w:w="1020"/>
+            <w:shd w:val="clear" w:color="auto" w:fill="FFFFFF"/>
+            <w:tcBorders>
+              <w:top w:val="single" w:sz="4" w:space="0" w:color="B9C4D4"/>
+              <w:left w:val="single" w:sz="4" w:space="0" w:color="B9C4D4"/>
+              <w:bottom w:val="single" w:sz="4" w:space="0" w:color="B9C4D4"/>
+              <w:right w:val="single" w:sz="4" w:space="0" w:color="B9C4D4"/>
+            </w:tcBorders>
+            <w:vAlign w:val="center"/>
+          </w:tcPr>
+          <w:p>
+            <w:r/>
+            <w:r>
+              <w:rPr>
+                <w:rFonts w:ascii="Calibri" w:hAnsi="Calibri"/>
+                <w:b/>
+                <w:i w:val="0"/>
+                <w:color w:val="1B365D"/>
+                <w:sz w:val="19"/>
+              </w:rPr>
+              <w:t>OS-09</w:t>
+            </w:r>
+          </w:p>
+        </w:tc>
+        <w:tc>
+          <w:tcPr>
+            <w:tcW w:type="dxa" w:w="2835"/>
+            <w:shd w:val="clear" w:color="auto" w:fill="FFFFFF"/>
+            <w:tcBorders>
+              <w:top w:val="single" w:sz="4" w:space="0" w:color="B9C4D4"/>
+              <w:left w:val="single" w:sz="4" w:space="0" w:color="B9C4D4"/>
+              <w:bottom w:val="single" w:sz="4" w:space="0" w:color="B9C4D4"/>
+              <w:right w:val="single" w:sz="4" w:space="0" w:color="B9C4D4"/>
+            </w:tcBorders>
+            <w:vAlign w:val="center"/>
+          </w:tcPr>
+          <w:p>
+            <w:r/>
+            <w:r>
+              <w:rPr>
+                <w:rFonts w:ascii="Calibri" w:hAnsi="Calibri"/>
+                <w:b w:val="0"/>
+                <w:i w:val="0"/>
+                <w:color w:val="222222"/>
+                <w:sz w:val="19"/>
+              </w:rPr>
+              <w:t>Trang/tài liệu pháp lý chi tiết (điều khoản sử dụng, chính sách bảo mật đầy đủ)</w:t>
+            </w:r>
+          </w:p>
+        </w:tc>
+        <w:tc>
+          <w:tcPr>
+            <w:tcW w:type="dxa" w:w="4649"/>
+            <w:shd w:val="clear" w:color="auto" w:fill="FFFFFF"/>
+            <w:tcBorders>
+              <w:top w:val="single" w:sz="4" w:space="0" w:color="B9C4D4"/>
+              <w:left w:val="single" w:sz="4" w:space="0" w:color="B9C4D4"/>
+              <w:bottom w:val="single" w:sz="4" w:space="0" w:color="B9C4D4"/>
+              <w:right w:val="single" w:sz="4" w:space="0" w:color="B9C4D4"/>
+            </w:tcBorders>
+            <w:vAlign w:val="center"/>
+          </w:tcPr>
+          <w:p>
+            <w:r/>
+            <w:r>
+              <w:rPr>
+                <w:rFonts w:ascii="Calibri" w:hAnsi="Calibri"/>
+                <w:b w:val="0"/>
+                <w:i w:val="0"/>
+                <w:color w:val="222222"/>
+                <w:sz w:val="19"/>
+              </w:rPr>
+              <w:t>Vượt quá mức cần thiết của một đồ án cá nhân; chỉ tuân thủ các yêu cầu lưu trữ dữ liệu cơ bản theo pháp luật hiện hành (xem CON-06 ở SRS) mà không soạn văn bản pháp lý đầy đủ.</w:t>
             </w:r>
           </w:p>
         </w:tc>
@@ -6479,7 +6918,7 @@
                 <w:color w:val="222222"/>
                 <w:sz w:val="19"/>
               </w:rPr>
-              <w:t>Khách hàng có thiết bị và kết nối Internet để đặt thuê/mua online.</w:t>
+              <w:t>Khách hàng có thiết bị và kết nối Internet để đặt thuê/mua online (bắt buộc, vì hệ thống không còn kênh tại quầy).</w:t>
             </w:r>
           </w:p>
         </w:tc>
@@ -6505,7 +6944,7 @@
                 <w:color w:val="222222"/>
                 <w:sz w:val="19"/>
               </w:rPr>
-              <w:t>Nếu sai: tỷ trọng đơn online (BO-02) khó đạt, cần duy trì kênh tại quầy lâu hơn dự kiến.</w:t>
+              <w:t>Nếu sai: khách không có cách nào khác để mua/thuê, có thể mất khách hàng mục tiêu không quen dùng web.</w:t>
             </w:r>
           </w:p>
         </w:tc>
@@ -6744,6 +7183,112 @@
                 <w:sz w:val="19"/>
               </w:rPr>
               <w:t>Chủ đầu tư</w:t>
+            </w:r>
+          </w:p>
+        </w:tc>
+      </w:tr>
+      <w:tr>
+        <w:tc>
+          <w:tcPr>
+            <w:tcW w:type="dxa" w:w="1020"/>
+            <w:shd w:val="clear" w:color="auto" w:fill="EEF2F7"/>
+            <w:tcBorders>
+              <w:top w:val="single" w:sz="4" w:space="0" w:color="B9C4D4"/>
+              <w:left w:val="single" w:sz="4" w:space="0" w:color="B9C4D4"/>
+              <w:bottom w:val="single" w:sz="4" w:space="0" w:color="B9C4D4"/>
+              <w:right w:val="single" w:sz="4" w:space="0" w:color="B9C4D4"/>
+            </w:tcBorders>
+            <w:vAlign w:val="center"/>
+          </w:tcPr>
+          <w:p>
+            <w:r/>
+            <w:r>
+              <w:rPr>
+                <w:rFonts w:ascii="Calibri" w:hAnsi="Calibri"/>
+                <w:b/>
+                <w:i w:val="0"/>
+                <w:color w:val="1B365D"/>
+                <w:sz w:val="19"/>
+              </w:rPr>
+              <w:t>AS-04</w:t>
+            </w:r>
+          </w:p>
+        </w:tc>
+        <w:tc>
+          <w:tcPr>
+            <w:tcW w:type="dxa" w:w="3118"/>
+            <w:shd w:val="clear" w:color="auto" w:fill="EEF2F7"/>
+            <w:tcBorders>
+              <w:top w:val="single" w:sz="4" w:space="0" w:color="B9C4D4"/>
+              <w:left w:val="single" w:sz="4" w:space="0" w:color="B9C4D4"/>
+              <w:bottom w:val="single" w:sz="4" w:space="0" w:color="B9C4D4"/>
+              <w:right w:val="single" w:sz="4" w:space="0" w:color="B9C4D4"/>
+            </w:tcBorders>
+            <w:vAlign w:val="center"/>
+          </w:tcPr>
+          <w:p>
+            <w:r/>
+            <w:r>
+              <w:rPr>
+                <w:rFonts w:ascii="Calibri" w:hAnsi="Calibri"/>
+                <w:b w:val="0"/>
+                <w:i w:val="0"/>
+                <w:color w:val="222222"/>
+                <w:sz w:val="19"/>
+              </w:rPr>
+              <w:t>Mọi địa chỉ nhận/trả hàng của khách đều nằm trong phạm vi phục vụ của Green SM (≤ 20km) hoặc Shopee Express (giả định phủ toàn quốc).</w:t>
+            </w:r>
+          </w:p>
+        </w:tc>
+        <w:tc>
+          <w:tcPr>
+            <w:tcW w:type="dxa" w:w="2835"/>
+            <w:shd w:val="clear" w:color="auto" w:fill="EEF2F7"/>
+            <w:tcBorders>
+              <w:top w:val="single" w:sz="4" w:space="0" w:color="B9C4D4"/>
+              <w:left w:val="single" w:sz="4" w:space="0" w:color="B9C4D4"/>
+              <w:bottom w:val="single" w:sz="4" w:space="0" w:color="B9C4D4"/>
+              <w:right w:val="single" w:sz="4" w:space="0" w:color="B9C4D4"/>
+            </w:tcBorders>
+            <w:vAlign w:val="center"/>
+          </w:tcPr>
+          <w:p>
+            <w:r/>
+            <w:r>
+              <w:rPr>
+                <w:rFonts w:ascii="Calibri" w:hAnsi="Calibri"/>
+                <w:b w:val="0"/>
+                <w:i w:val="0"/>
+                <w:color w:val="222222"/>
+                <w:sz w:val="19"/>
+              </w:rPr>
+              <w:t>Nếu sai: cần bổ sung đối tác giao vận thứ ba cho khu vực chưa được phủ.</w:t>
+            </w:r>
+          </w:p>
+        </w:tc>
+        <w:tc>
+          <w:tcPr>
+            <w:tcW w:type="dxa" w:w="1531"/>
+            <w:shd w:val="clear" w:color="auto" w:fill="EEF2F7"/>
+            <w:tcBorders>
+              <w:top w:val="single" w:sz="4" w:space="0" w:color="B9C4D4"/>
+              <w:left w:val="single" w:sz="4" w:space="0" w:color="B9C4D4"/>
+              <w:bottom w:val="single" w:sz="4" w:space="0" w:color="B9C4D4"/>
+              <w:right w:val="single" w:sz="4" w:space="0" w:color="B9C4D4"/>
+            </w:tcBorders>
+            <w:vAlign w:val="center"/>
+          </w:tcPr>
+          <w:p>
+            <w:r/>
+            <w:r>
+              <w:rPr>
+                <w:rFonts w:ascii="Calibri" w:hAnsi="Calibri"/>
+                <w:b w:val="0"/>
+                <w:i w:val="0"/>
+                <w:color w:val="222222"/>
+                <w:sz w:val="19"/>
+              </w:rPr>
+              <w:t>Quản lý vận hành</w:t>
             </w:r>
           </w:p>
         </w:tc>
@@ -7103,6 +7648,60 @@
                 <w:sz w:val="19"/>
               </w:rPr>
               <w:t>Việc tích hợp với đối tác giao vận và cổng thanh toán chỉ ở mức giả lập API (mock) phục vụ đồ án, không phát sinh chi phí hợp tác thực tế với nhà cung cấp bên thứ ba.</w:t>
+            </w:r>
+          </w:p>
+        </w:tc>
+      </w:tr>
+      <w:tr>
+        <w:tc>
+          <w:tcPr>
+            <w:tcW w:type="dxa" w:w="1134"/>
+            <w:shd w:val="clear" w:color="auto" w:fill="EEF2F7"/>
+            <w:tcBorders>
+              <w:top w:val="single" w:sz="4" w:space="0" w:color="B9C4D4"/>
+              <w:left w:val="single" w:sz="4" w:space="0" w:color="B9C4D4"/>
+              <w:bottom w:val="single" w:sz="4" w:space="0" w:color="B9C4D4"/>
+              <w:right w:val="single" w:sz="4" w:space="0" w:color="B9C4D4"/>
+            </w:tcBorders>
+            <w:vAlign w:val="center"/>
+          </w:tcPr>
+          <w:p>
+            <w:r/>
+            <w:r>
+              <w:rPr>
+                <w:rFonts w:ascii="Calibri" w:hAnsi="Calibri"/>
+                <w:b/>
+                <w:i w:val="0"/>
+                <w:color w:val="1B365D"/>
+                <w:sz w:val="19"/>
+              </w:rPr>
+              <w:t>CT-06</w:t>
+            </w:r>
+          </w:p>
+        </w:tc>
+        <w:tc>
+          <w:tcPr>
+            <w:tcW w:type="dxa" w:w="7370"/>
+            <w:shd w:val="clear" w:color="auto" w:fill="EEF2F7"/>
+            <w:tcBorders>
+              <w:top w:val="single" w:sz="4" w:space="0" w:color="B9C4D4"/>
+              <w:left w:val="single" w:sz="4" w:space="0" w:color="B9C4D4"/>
+              <w:bottom w:val="single" w:sz="4" w:space="0" w:color="B9C4D4"/>
+              <w:right w:val="single" w:sz="4" w:space="0" w:color="B9C4D4"/>
+            </w:tcBorders>
+            <w:vAlign w:val="center"/>
+          </w:tcPr>
+          <w:p>
+            <w:r/>
+            <w:r>
+              <w:rPr>
+                <w:rFonts w:ascii="Calibri" w:hAnsi="Calibri"/>
+                <w:b w:val="0"/>
+                <w:i w:val="0"/>
+                <w:color w:val="222222"/>
+                <w:sz w:val="19"/>
+              </w:rPr>
+              <w:t>Hệ thống không vận hành kênh bán/thuê tại quầy hoặc cửa hàng vật lý nào; 100% đơn hàng/đơn thuê phát sinh và xử lý qua website.</w:t>
             </w:r>
           </w:p>
         </w:tc>
@@ -7543,7 +8142,7 @@
                 <w:color w:val="222222"/>
                 <w:sz w:val="19"/>
               </w:rPr>
-              <w:t>Cung cấp API tạo yêu cầu giao/lấy hàng và webhook cập nhật trạng thái vận chuyển.</w:t>
+              <w:t>Cung cấp API tạo yêu cầu giao/lấy hàng, tính phí theo khoảng cách và webhook cập nhật trạng thái vận chuyển cho các chặng trong bán kính 20km.</w:t>
             </w:r>
           </w:p>
         </w:tc>
@@ -7657,6 +8256,112 @@
           <w:tcPr>
             <w:tcW w:type="dxa" w:w="1531"/>
             <w:shd w:val="clear" w:color="auto" w:fill="EEF2F7"/>
+            <w:tcBorders>
+              <w:top w:val="single" w:sz="4" w:space="0" w:color="B9C4D4"/>
+              <w:left w:val="single" w:sz="4" w:space="0" w:color="B9C4D4"/>
+              <w:bottom w:val="single" w:sz="4" w:space="0" w:color="B9C4D4"/>
+              <w:right w:val="single" w:sz="4" w:space="0" w:color="B9C4D4"/>
+            </w:tcBorders>
+            <w:vAlign w:val="center"/>
+          </w:tcPr>
+          <w:p>
+            <w:r/>
+            <w:r>
+              <w:rPr>
+                <w:rFonts w:ascii="Calibri" w:hAnsi="Calibri"/>
+                <w:b w:val="0"/>
+                <w:i w:val="0"/>
+                <w:color w:val="222222"/>
+                <w:sz w:val="19"/>
+              </w:rPr>
+              <w:t>Trước khi bắt đầu Giai đoạn 3 (SDD).</w:t>
+            </w:r>
+          </w:p>
+        </w:tc>
+      </w:tr>
+      <w:tr>
+        <w:tc>
+          <w:tcPr>
+            <w:tcW w:type="dxa" w:w="1020"/>
+            <w:shd w:val="clear" w:color="auto" w:fill="FFFFFF"/>
+            <w:tcBorders>
+              <w:top w:val="single" w:sz="4" w:space="0" w:color="B9C4D4"/>
+              <w:left w:val="single" w:sz="4" w:space="0" w:color="B9C4D4"/>
+              <w:bottom w:val="single" w:sz="4" w:space="0" w:color="B9C4D4"/>
+              <w:right w:val="single" w:sz="4" w:space="0" w:color="B9C4D4"/>
+            </w:tcBorders>
+            <w:vAlign w:val="center"/>
+          </w:tcPr>
+          <w:p>
+            <w:r/>
+            <w:r>
+              <w:rPr>
+                <w:rFonts w:ascii="Calibri" w:hAnsi="Calibri"/>
+                <w:b/>
+                <w:i w:val="0"/>
+                <w:color w:val="1B365D"/>
+                <w:sz w:val="19"/>
+              </w:rPr>
+              <w:t>DP-05</w:t>
+            </w:r>
+          </w:p>
+        </w:tc>
+        <w:tc>
+          <w:tcPr>
+            <w:tcW w:type="dxa" w:w="2268"/>
+            <w:shd w:val="clear" w:color="auto" w:fill="FFFFFF"/>
+            <w:tcBorders>
+              <w:top w:val="single" w:sz="4" w:space="0" w:color="B9C4D4"/>
+              <w:left w:val="single" w:sz="4" w:space="0" w:color="B9C4D4"/>
+              <w:bottom w:val="single" w:sz="4" w:space="0" w:color="B9C4D4"/>
+              <w:right w:val="single" w:sz="4" w:space="0" w:color="B9C4D4"/>
+            </w:tcBorders>
+            <w:vAlign w:val="center"/>
+          </w:tcPr>
+          <w:p>
+            <w:r/>
+            <w:r>
+              <w:rPr>
+                <w:rFonts w:ascii="Calibri" w:hAnsi="Calibri"/>
+                <w:b w:val="0"/>
+                <w:i w:val="0"/>
+                <w:color w:val="222222"/>
+                <w:sz w:val="19"/>
+              </w:rPr>
+              <w:t>Shopee Express (giả định)</w:t>
+            </w:r>
+          </w:p>
+        </w:tc>
+        <w:tc>
+          <w:tcPr>
+            <w:tcW w:type="dxa" w:w="3685"/>
+            <w:shd w:val="clear" w:color="auto" w:fill="FFFFFF"/>
+            <w:tcBorders>
+              <w:top w:val="single" w:sz="4" w:space="0" w:color="B9C4D4"/>
+              <w:left w:val="single" w:sz="4" w:space="0" w:color="B9C4D4"/>
+              <w:bottom w:val="single" w:sz="4" w:space="0" w:color="B9C4D4"/>
+              <w:right w:val="single" w:sz="4" w:space="0" w:color="B9C4D4"/>
+            </w:tcBorders>
+            <w:vAlign w:val="center"/>
+          </w:tcPr>
+          <w:p>
+            <w:r/>
+            <w:r>
+              <w:rPr>
+                <w:rFonts w:ascii="Calibri" w:hAnsi="Calibri"/>
+                <w:b w:val="0"/>
+                <w:i w:val="0"/>
+                <w:color w:val="222222"/>
+                <w:sz w:val="19"/>
+              </w:rPr>
+              <w:t>Cung cấp API tạo yêu cầu giao/lấy hàng, tính phí theo khoảng cách và webhook cập nhật trạng thái vận chuyển cho các chặng ngoài bán kính 20km.</w:t>
+            </w:r>
+          </w:p>
+        </w:tc>
+        <w:tc>
+          <w:tcPr>
+            <w:tcW w:type="dxa" w:w="1531"/>
+            <w:shd w:val="clear" w:color="auto" w:fill="FFFFFF"/>
             <w:tcBorders>
               <w:top w:val="single" w:sz="4" w:space="0" w:color="B9C4D4"/>
               <w:left w:val="single" w:sz="4" w:space="0" w:color="B9C4D4"/>
@@ -7904,7 +8609,7 @@
                 <w:color w:val="222222"/>
                 <w:sz w:val="19"/>
               </w:rPr>
-              <w:t>Thuê/mua board game nhanh, minh bạch tiền cọc, không mất thời gian chờ tại quầy.</w:t>
+              <w:t>Thuê/mua board game nhanh, minh bạch tiền cọc, giao/nhận hàng đúng hẹn tận nơi.</w:t>
             </w:r>
           </w:p>
         </w:tc>
@@ -8012,7 +8717,7 @@
                 <w:color w:val="222222"/>
                 <w:sz w:val="19"/>
               </w:rPr>
-              <w:t>Nhân viên kho/quầy (Staff)</w:t>
+              <w:t>Nhân viên kho/xử lý đơn hàng (Staff)</w:t>
             </w:r>
           </w:p>
         </w:tc>
@@ -8304,7 +9009,7 @@
                 <w:color w:val="222222"/>
                 <w:sz w:val="19"/>
               </w:rPr>
-              <w:t>Nhận yêu cầu giao/lấy hàng rõ ràng qua API, được thanh toán phí ship đúng và kịp thời.</w:t>
+              <w:t>Nhận yêu cầu giao/lấy hàng rõ ràng qua API trong bán kính phục vụ, được thanh toán phí ship đúng và kịp thời.</w:t>
             </w:r>
           </w:p>
         </w:tc>
@@ -8332,7 +9037,7 @@
                 <w:color w:val="222222"/>
                 <w:sz w:val="19"/>
               </w:rPr>
-              <w:t>Giảng viên hướng dẫn (vai trò phê duyệt giả định)</w:t>
+              <w:t>Shopee Express (giả định)</w:t>
             </w:r>
           </w:p>
         </w:tc>
@@ -8366,6 +9071,86 @@
           <w:tcPr>
             <w:tcW w:type="dxa" w:w="4252"/>
             <w:shd w:val="clear" w:color="auto" w:fill="FFFFFF"/>
+            <w:tcBorders>
+              <w:top w:val="single" w:sz="4" w:space="0" w:color="B9C4D4"/>
+              <w:left w:val="single" w:sz="4" w:space="0" w:color="B9C4D4"/>
+              <w:bottom w:val="single" w:sz="4" w:space="0" w:color="B9C4D4"/>
+              <w:right w:val="single" w:sz="4" w:space="0" w:color="B9C4D4"/>
+            </w:tcBorders>
+            <w:vAlign w:val="center"/>
+          </w:tcPr>
+          <w:p>
+            <w:r/>
+            <w:r>
+              <w:rPr>
+                <w:rFonts w:ascii="Calibri" w:hAnsi="Calibri"/>
+                <w:b w:val="0"/>
+                <w:i w:val="0"/>
+                <w:color w:val="222222"/>
+                <w:sz w:val="19"/>
+              </w:rPr>
+              <w:t>Nhận yêu cầu giao/lấy hàng ngoài bán kính 20km qua API, được thanh toán phí ship đúng và kịp thời.</w:t>
+            </w:r>
+          </w:p>
+        </w:tc>
+      </w:tr>
+      <w:tr>
+        <w:tc>
+          <w:tcPr>
+            <w:tcW w:type="dxa" w:w="2551"/>
+            <w:shd w:val="clear" w:color="auto" w:fill="EEF2F7"/>
+            <w:tcBorders>
+              <w:top w:val="single" w:sz="4" w:space="0" w:color="B9C4D4"/>
+              <w:left w:val="single" w:sz="4" w:space="0" w:color="B9C4D4"/>
+              <w:bottom w:val="single" w:sz="4" w:space="0" w:color="B9C4D4"/>
+              <w:right w:val="single" w:sz="4" w:space="0" w:color="B9C4D4"/>
+            </w:tcBorders>
+            <w:vAlign w:val="center"/>
+          </w:tcPr>
+          <w:p>
+            <w:r/>
+            <w:r>
+              <w:rPr>
+                <w:rFonts w:ascii="Calibri" w:hAnsi="Calibri"/>
+                <w:b w:val="0"/>
+                <w:i w:val="0"/>
+                <w:color w:val="222222"/>
+                <w:sz w:val="19"/>
+              </w:rPr>
+              <w:t>Giảng viên hướng dẫn (vai trò phê duyệt giả định)</w:t>
+            </w:r>
+          </w:p>
+        </w:tc>
+        <w:tc>
+          <w:tcPr>
+            <w:tcW w:type="dxa" w:w="1701"/>
+            <w:shd w:val="clear" w:color="auto" w:fill="EEF2F7"/>
+            <w:tcBorders>
+              <w:top w:val="single" w:sz="4" w:space="0" w:color="B9C4D4"/>
+              <w:left w:val="single" w:sz="4" w:space="0" w:color="B9C4D4"/>
+              <w:bottom w:val="single" w:sz="4" w:space="0" w:color="B9C4D4"/>
+              <w:right w:val="single" w:sz="4" w:space="0" w:color="B9C4D4"/>
+            </w:tcBorders>
+            <w:vAlign w:val="center"/>
+          </w:tcPr>
+          <w:p>
+            <w:r/>
+            <w:r>
+              <w:rPr>
+                <w:rFonts w:ascii="Calibri" w:hAnsi="Calibri"/>
+                <w:b w:val="0"/>
+                <w:i w:val="0"/>
+                <w:color w:val="222222"/>
+                <w:sz w:val="19"/>
+              </w:rPr>
+              <w:t>Bên ngoài</w:t>
+            </w:r>
+          </w:p>
+        </w:tc>
+        <w:tc>
+          <w:tcPr>
+            <w:tcW w:type="dxa" w:w="4252"/>
+            <w:shd w:val="clear" w:color="auto" w:fill="EEF2F7"/>
             <w:tcBorders>
               <w:top w:val="single" w:sz="4" w:space="0" w:color="B9C4D4"/>
               <w:left w:val="single" w:sz="4" w:space="0" w:color="B9C4D4"/>
@@ -8535,7 +9320,7 @@
                 <w:color w:val="FFFFFF"/>
                 <w:sz w:val="20"/>
               </w:rPr>
-              <w:t>Nhân viên kho/quầy</w:t>
+              <w:t>Nhân viên kho/xử lý đơn hàng</w:t>
             </w:r>
           </w:p>
         </w:tc>
@@ -9975,7 +10760,7 @@
           <w:color w:val="1B1B1B"/>
           <w:sz w:val="19"/>
         </w:rPr>
-        <w:t>:Nhân viên xác nhận đơn và xuất kho trên hệ thống;</w:t>
+        <w:t>:Nhân viên xác nhận đơn và bàn giao cho đối tác giao vận mang đến tận nơi cho khách;</w:t>
         <w:br/>
       </w:r>
       <w:r>
@@ -9997,7 +10782,7 @@
           <w:color w:val="1B1B1B"/>
           <w:sz w:val="19"/>
         </w:rPr>
-        <w:t>:Khách trả hàng, nhân viên kiểm đếm theo checklist điện tử;</w:t>
+        <w:t>:Đối tác giao vận đến lấy hàng trả, nhân viên kiểm đếm theo checklist điện tử khi hàng về kho;</w:t>
         <w:br/>
       </w:r>
       <w:r>
@@ -12154,7 +12939,7 @@
                 <w:color w:val="222222"/>
                 <w:sz w:val="19"/>
               </w:rPr>
-              <w:t>Hệ thống phải cho phép khách hàng chọn hình thức nhận hàng (tự đến lấy hoặc giao vận) và hình thức trả hàng (tự mang trả hoặc gọi giao vận đến lấy), tính phí giao vận theo khu vực.</w:t>
+              <w:t>Hệ thống phải giao hàng và lấy hàng trả tận nơi cho khách ở cả hai chiều thông qua đối tác giao vận (không có hình thức tự đến lấy/tự mang trả), tự động chọn đối tác và tính phí giao vận theo khoảng cách giao nhận.</w:t>
             </w:r>
           </w:p>
         </w:tc>
@@ -12260,7 +13045,7 @@
                 <w:color w:val="222222"/>
                 <w:sz w:val="19"/>
               </w:rPr>
-              <w:t>Hệ thống phải cho phép khách hàng thanh toán trực tuyến bằng mã QR qua cổng thanh toán (ví điện tử/ngân hàng).</w:t>
+              <w:t>Hệ thống phải cho phép khách hàng thanh toán trực tuyến bằng mã QR qua cổng thanh toán (ví điện tử/ngân hàng), và hoàn tiền vào ví điện tử nội bộ trên hệ thống khi cần hoàn cọc.</w:t>
             </w:r>
           </w:p>
         </w:tc>
@@ -12287,6 +13072,642 @@
                 <w:sz w:val="19"/>
               </w:rPr>
               <w:t>BO-02, BO-05</w:t>
+            </w:r>
+          </w:p>
+        </w:tc>
+        <w:tc>
+          <w:tcPr>
+            <w:tcW w:type="dxa" w:w="1134"/>
+            <w:shd w:val="clear" w:color="auto" w:fill="EEF2F7"/>
+            <w:tcBorders>
+              <w:top w:val="single" w:sz="4" w:space="0" w:color="B9C4D4"/>
+              <w:left w:val="single" w:sz="4" w:space="0" w:color="B9C4D4"/>
+              <w:bottom w:val="single" w:sz="4" w:space="0" w:color="B9C4D4"/>
+              <w:right w:val="single" w:sz="4" w:space="0" w:color="B9C4D4"/>
+            </w:tcBorders>
+            <w:vAlign w:val="center"/>
+          </w:tcPr>
+          <w:p>
+            <w:r/>
+            <w:r>
+              <w:rPr>
+                <w:rFonts w:ascii="Calibri" w:hAnsi="Calibri"/>
+                <w:b w:val="0"/>
+                <w:i w:val="0"/>
+                <w:color w:val="222222"/>
+                <w:sz w:val="19"/>
+              </w:rPr>
+              <w:t>Must</w:t>
+            </w:r>
+          </w:p>
+        </w:tc>
+      </w:tr>
+      <w:tr>
+        <w:tc>
+          <w:tcPr>
+            <w:tcW w:type="dxa" w:w="907"/>
+            <w:shd w:val="clear" w:color="auto" w:fill="FFFFFF"/>
+            <w:tcBorders>
+              <w:top w:val="single" w:sz="4" w:space="0" w:color="B9C4D4"/>
+              <w:left w:val="single" w:sz="4" w:space="0" w:color="B9C4D4"/>
+              <w:bottom w:val="single" w:sz="4" w:space="0" w:color="B9C4D4"/>
+              <w:right w:val="single" w:sz="4" w:space="0" w:color="B9C4D4"/>
+            </w:tcBorders>
+            <w:vAlign w:val="center"/>
+          </w:tcPr>
+          <w:p>
+            <w:r/>
+            <w:r>
+              <w:rPr>
+                <w:rFonts w:ascii="Calibri" w:hAnsi="Calibri"/>
+                <w:b/>
+                <w:i w:val="0"/>
+                <w:color w:val="1B365D"/>
+                <w:sz w:val="19"/>
+              </w:rPr>
+              <w:t>BR-11</w:t>
+            </w:r>
+          </w:p>
+        </w:tc>
+        <w:tc>
+          <w:tcPr>
+            <w:tcW w:type="dxa" w:w="5102"/>
+            <w:shd w:val="clear" w:color="auto" w:fill="FFFFFF"/>
+            <w:tcBorders>
+              <w:top w:val="single" w:sz="4" w:space="0" w:color="B9C4D4"/>
+              <w:left w:val="single" w:sz="4" w:space="0" w:color="B9C4D4"/>
+              <w:bottom w:val="single" w:sz="4" w:space="0" w:color="B9C4D4"/>
+              <w:right w:val="single" w:sz="4" w:space="0" w:color="B9C4D4"/>
+            </w:tcBorders>
+            <w:vAlign w:val="center"/>
+          </w:tcPr>
+          <w:p>
+            <w:r/>
+            <w:r>
+              <w:rPr>
+                <w:rFonts w:ascii="Calibri" w:hAnsi="Calibri"/>
+                <w:b w:val="0"/>
+                <w:i w:val="0"/>
+                <w:color w:val="222222"/>
+                <w:sz w:val="19"/>
+              </w:rPr>
+              <w:t>Hệ thống phải cho phép Admin đăng nhập riêng biệt với khách hàng, và tạo/sửa/khoá tài khoản nhân viên (Staff).</w:t>
+            </w:r>
+          </w:p>
+        </w:tc>
+        <w:tc>
+          <w:tcPr>
+            <w:tcW w:type="dxa" w:w="1361"/>
+            <w:shd w:val="clear" w:color="auto" w:fill="FFFFFF"/>
+            <w:tcBorders>
+              <w:top w:val="single" w:sz="4" w:space="0" w:color="B9C4D4"/>
+              <w:left w:val="single" w:sz="4" w:space="0" w:color="B9C4D4"/>
+              <w:bottom w:val="single" w:sz="4" w:space="0" w:color="B9C4D4"/>
+              <w:right w:val="single" w:sz="4" w:space="0" w:color="B9C4D4"/>
+            </w:tcBorders>
+            <w:vAlign w:val="center"/>
+          </w:tcPr>
+          <w:p>
+            <w:r/>
+            <w:r>
+              <w:rPr>
+                <w:rFonts w:ascii="Calibri" w:hAnsi="Calibri"/>
+                <w:b w:val="0"/>
+                <w:i w:val="0"/>
+                <w:color w:val="222222"/>
+                <w:sz w:val="19"/>
+              </w:rPr>
+              <w:t>BO-03</w:t>
+            </w:r>
+          </w:p>
+        </w:tc>
+        <w:tc>
+          <w:tcPr>
+            <w:tcW w:type="dxa" w:w="1134"/>
+            <w:shd w:val="clear" w:color="auto" w:fill="FFFFFF"/>
+            <w:tcBorders>
+              <w:top w:val="single" w:sz="4" w:space="0" w:color="B9C4D4"/>
+              <w:left w:val="single" w:sz="4" w:space="0" w:color="B9C4D4"/>
+              <w:bottom w:val="single" w:sz="4" w:space="0" w:color="B9C4D4"/>
+              <w:right w:val="single" w:sz="4" w:space="0" w:color="B9C4D4"/>
+            </w:tcBorders>
+            <w:vAlign w:val="center"/>
+          </w:tcPr>
+          <w:p>
+            <w:r/>
+            <w:r>
+              <w:rPr>
+                <w:rFonts w:ascii="Calibri" w:hAnsi="Calibri"/>
+                <w:b w:val="0"/>
+                <w:i w:val="0"/>
+                <w:color w:val="222222"/>
+                <w:sz w:val="19"/>
+              </w:rPr>
+              <w:t>Must</w:t>
+            </w:r>
+          </w:p>
+        </w:tc>
+      </w:tr>
+      <w:tr>
+        <w:tc>
+          <w:tcPr>
+            <w:tcW w:type="dxa" w:w="907"/>
+            <w:shd w:val="clear" w:color="auto" w:fill="EEF2F7"/>
+            <w:tcBorders>
+              <w:top w:val="single" w:sz="4" w:space="0" w:color="B9C4D4"/>
+              <w:left w:val="single" w:sz="4" w:space="0" w:color="B9C4D4"/>
+              <w:bottom w:val="single" w:sz="4" w:space="0" w:color="B9C4D4"/>
+              <w:right w:val="single" w:sz="4" w:space="0" w:color="B9C4D4"/>
+            </w:tcBorders>
+            <w:vAlign w:val="center"/>
+          </w:tcPr>
+          <w:p>
+            <w:r/>
+            <w:r>
+              <w:rPr>
+                <w:rFonts w:ascii="Calibri" w:hAnsi="Calibri"/>
+                <w:b/>
+                <w:i w:val="0"/>
+                <w:color w:val="1B365D"/>
+                <w:sz w:val="19"/>
+              </w:rPr>
+              <w:t>BR-12</w:t>
+            </w:r>
+          </w:p>
+        </w:tc>
+        <w:tc>
+          <w:tcPr>
+            <w:tcW w:type="dxa" w:w="5102"/>
+            <w:shd w:val="clear" w:color="auto" w:fill="EEF2F7"/>
+            <w:tcBorders>
+              <w:top w:val="single" w:sz="4" w:space="0" w:color="B9C4D4"/>
+              <w:left w:val="single" w:sz="4" w:space="0" w:color="B9C4D4"/>
+              <w:bottom w:val="single" w:sz="4" w:space="0" w:color="B9C4D4"/>
+              <w:right w:val="single" w:sz="4" w:space="0" w:color="B9C4D4"/>
+            </w:tcBorders>
+            <w:vAlign w:val="center"/>
+          </w:tcPr>
+          <w:p>
+            <w:r/>
+            <w:r>
+              <w:rPr>
+                <w:rFonts w:ascii="Calibri" w:hAnsi="Calibri"/>
+                <w:b w:val="0"/>
+                <w:i w:val="0"/>
+                <w:color w:val="222222"/>
+                <w:sz w:val="19"/>
+              </w:rPr>
+              <w:t>Hệ thống phải cho phép Admin thêm/sửa/xoá sản phẩm, cập nhật giá bán và giá thuê.</w:t>
+            </w:r>
+          </w:p>
+        </w:tc>
+        <w:tc>
+          <w:tcPr>
+            <w:tcW w:type="dxa" w:w="1361"/>
+            <w:shd w:val="clear" w:color="auto" w:fill="EEF2F7"/>
+            <w:tcBorders>
+              <w:top w:val="single" w:sz="4" w:space="0" w:color="B9C4D4"/>
+              <w:left w:val="single" w:sz="4" w:space="0" w:color="B9C4D4"/>
+              <w:bottom w:val="single" w:sz="4" w:space="0" w:color="B9C4D4"/>
+              <w:right w:val="single" w:sz="4" w:space="0" w:color="B9C4D4"/>
+            </w:tcBorders>
+            <w:vAlign w:val="center"/>
+          </w:tcPr>
+          <w:p>
+            <w:r/>
+            <w:r>
+              <w:rPr>
+                <w:rFonts w:ascii="Calibri" w:hAnsi="Calibri"/>
+                <w:b w:val="0"/>
+                <w:i w:val="0"/>
+                <w:color w:val="222222"/>
+                <w:sz w:val="19"/>
+              </w:rPr>
+              <w:t>BO-04</w:t>
+            </w:r>
+          </w:p>
+        </w:tc>
+        <w:tc>
+          <w:tcPr>
+            <w:tcW w:type="dxa" w:w="1134"/>
+            <w:shd w:val="clear" w:color="auto" w:fill="EEF2F7"/>
+            <w:tcBorders>
+              <w:top w:val="single" w:sz="4" w:space="0" w:color="B9C4D4"/>
+              <w:left w:val="single" w:sz="4" w:space="0" w:color="B9C4D4"/>
+              <w:bottom w:val="single" w:sz="4" w:space="0" w:color="B9C4D4"/>
+              <w:right w:val="single" w:sz="4" w:space="0" w:color="B9C4D4"/>
+            </w:tcBorders>
+            <w:vAlign w:val="center"/>
+          </w:tcPr>
+          <w:p>
+            <w:r/>
+            <w:r>
+              <w:rPr>
+                <w:rFonts w:ascii="Calibri" w:hAnsi="Calibri"/>
+                <w:b w:val="0"/>
+                <w:i w:val="0"/>
+                <w:color w:val="222222"/>
+                <w:sz w:val="19"/>
+              </w:rPr>
+              <w:t>Must</w:t>
+            </w:r>
+          </w:p>
+        </w:tc>
+      </w:tr>
+      <w:tr>
+        <w:tc>
+          <w:tcPr>
+            <w:tcW w:type="dxa" w:w="907"/>
+            <w:shd w:val="clear" w:color="auto" w:fill="FFFFFF"/>
+            <w:tcBorders>
+              <w:top w:val="single" w:sz="4" w:space="0" w:color="B9C4D4"/>
+              <w:left w:val="single" w:sz="4" w:space="0" w:color="B9C4D4"/>
+              <w:bottom w:val="single" w:sz="4" w:space="0" w:color="B9C4D4"/>
+              <w:right w:val="single" w:sz="4" w:space="0" w:color="B9C4D4"/>
+            </w:tcBorders>
+            <w:vAlign w:val="center"/>
+          </w:tcPr>
+          <w:p>
+            <w:r/>
+            <w:r>
+              <w:rPr>
+                <w:rFonts w:ascii="Calibri" w:hAnsi="Calibri"/>
+                <w:b/>
+                <w:i w:val="0"/>
+                <w:color w:val="1B365D"/>
+                <w:sz w:val="19"/>
+              </w:rPr>
+              <w:t>BR-13</w:t>
+            </w:r>
+          </w:p>
+        </w:tc>
+        <w:tc>
+          <w:tcPr>
+            <w:tcW w:type="dxa" w:w="5102"/>
+            <w:shd w:val="clear" w:color="auto" w:fill="FFFFFF"/>
+            <w:tcBorders>
+              <w:top w:val="single" w:sz="4" w:space="0" w:color="B9C4D4"/>
+              <w:left w:val="single" w:sz="4" w:space="0" w:color="B9C4D4"/>
+              <w:bottom w:val="single" w:sz="4" w:space="0" w:color="B9C4D4"/>
+              <w:right w:val="single" w:sz="4" w:space="0" w:color="B9C4D4"/>
+            </w:tcBorders>
+            <w:vAlign w:val="center"/>
+          </w:tcPr>
+          <w:p>
+            <w:r/>
+            <w:r>
+              <w:rPr>
+                <w:rFonts w:ascii="Calibri" w:hAnsi="Calibri"/>
+                <w:b w:val="0"/>
+                <w:i w:val="0"/>
+                <w:color w:val="222222"/>
+                <w:sz w:val="19"/>
+              </w:rPr>
+              <w:t>Hệ thống nên cung cấp cho Admin báo cáo tổng hợp tồn kho và trạng thái đơn hàng/đơn thuê, ngoài báo cáo doanh thu (BR-07).</w:t>
+            </w:r>
+          </w:p>
+        </w:tc>
+        <w:tc>
+          <w:tcPr>
+            <w:tcW w:type="dxa" w:w="1361"/>
+            <w:shd w:val="clear" w:color="auto" w:fill="FFFFFF"/>
+            <w:tcBorders>
+              <w:top w:val="single" w:sz="4" w:space="0" w:color="B9C4D4"/>
+              <w:left w:val="single" w:sz="4" w:space="0" w:color="B9C4D4"/>
+              <w:bottom w:val="single" w:sz="4" w:space="0" w:color="B9C4D4"/>
+              <w:right w:val="single" w:sz="4" w:space="0" w:color="B9C4D4"/>
+            </w:tcBorders>
+            <w:vAlign w:val="center"/>
+          </w:tcPr>
+          <w:p>
+            <w:r/>
+            <w:r>
+              <w:rPr>
+                <w:rFonts w:ascii="Calibri" w:hAnsi="Calibri"/>
+                <w:b w:val="0"/>
+                <w:i w:val="0"/>
+                <w:color w:val="222222"/>
+                <w:sz w:val="19"/>
+              </w:rPr>
+              <w:t>BO-04, BO-05</w:t>
+            </w:r>
+          </w:p>
+        </w:tc>
+        <w:tc>
+          <w:tcPr>
+            <w:tcW w:type="dxa" w:w="1134"/>
+            <w:shd w:val="clear" w:color="auto" w:fill="FFFFFF"/>
+            <w:tcBorders>
+              <w:top w:val="single" w:sz="4" w:space="0" w:color="B9C4D4"/>
+              <w:left w:val="single" w:sz="4" w:space="0" w:color="B9C4D4"/>
+              <w:bottom w:val="single" w:sz="4" w:space="0" w:color="B9C4D4"/>
+              <w:right w:val="single" w:sz="4" w:space="0" w:color="B9C4D4"/>
+            </w:tcBorders>
+            <w:vAlign w:val="center"/>
+          </w:tcPr>
+          <w:p>
+            <w:r/>
+            <w:r>
+              <w:rPr>
+                <w:rFonts w:ascii="Calibri" w:hAnsi="Calibri"/>
+                <w:b w:val="0"/>
+                <w:i w:val="0"/>
+                <w:color w:val="222222"/>
+                <w:sz w:val="19"/>
+              </w:rPr>
+              <w:t>Should</w:t>
+            </w:r>
+          </w:p>
+        </w:tc>
+      </w:tr>
+      <w:tr>
+        <w:tc>
+          <w:tcPr>
+            <w:tcW w:type="dxa" w:w="907"/>
+            <w:shd w:val="clear" w:color="auto" w:fill="EEF2F7"/>
+            <w:tcBorders>
+              <w:top w:val="single" w:sz="4" w:space="0" w:color="B9C4D4"/>
+              <w:left w:val="single" w:sz="4" w:space="0" w:color="B9C4D4"/>
+              <w:bottom w:val="single" w:sz="4" w:space="0" w:color="B9C4D4"/>
+              <w:right w:val="single" w:sz="4" w:space="0" w:color="B9C4D4"/>
+            </w:tcBorders>
+            <w:vAlign w:val="center"/>
+          </w:tcPr>
+          <w:p>
+            <w:r/>
+            <w:r>
+              <w:rPr>
+                <w:rFonts w:ascii="Calibri" w:hAnsi="Calibri"/>
+                <w:b/>
+                <w:i w:val="0"/>
+                <w:color w:val="1B365D"/>
+                <w:sz w:val="19"/>
+              </w:rPr>
+              <w:t>BR-14</w:t>
+            </w:r>
+          </w:p>
+        </w:tc>
+        <w:tc>
+          <w:tcPr>
+            <w:tcW w:type="dxa" w:w="5102"/>
+            <w:shd w:val="clear" w:color="auto" w:fill="EEF2F7"/>
+            <w:tcBorders>
+              <w:top w:val="single" w:sz="4" w:space="0" w:color="B9C4D4"/>
+              <w:left w:val="single" w:sz="4" w:space="0" w:color="B9C4D4"/>
+              <w:bottom w:val="single" w:sz="4" w:space="0" w:color="B9C4D4"/>
+              <w:right w:val="single" w:sz="4" w:space="0" w:color="B9C4D4"/>
+            </w:tcBorders>
+            <w:vAlign w:val="center"/>
+          </w:tcPr>
+          <w:p>
+            <w:r/>
+            <w:r>
+              <w:rPr>
+                <w:rFonts w:ascii="Calibri" w:hAnsi="Calibri"/>
+                <w:b w:val="0"/>
+                <w:i w:val="0"/>
+                <w:color w:val="222222"/>
+                <w:sz w:val="19"/>
+              </w:rPr>
+              <w:t>Hệ thống phải cho phép khách hàng tự cập nhật thông tin cá nhân của chính mình (họ tên, số điện thoại, địa chỉ, đổi mật khẩu).</w:t>
+            </w:r>
+          </w:p>
+        </w:tc>
+        <w:tc>
+          <w:tcPr>
+            <w:tcW w:type="dxa" w:w="1361"/>
+            <w:shd w:val="clear" w:color="auto" w:fill="EEF2F7"/>
+            <w:tcBorders>
+              <w:top w:val="single" w:sz="4" w:space="0" w:color="B9C4D4"/>
+              <w:left w:val="single" w:sz="4" w:space="0" w:color="B9C4D4"/>
+              <w:bottom w:val="single" w:sz="4" w:space="0" w:color="B9C4D4"/>
+              <w:right w:val="single" w:sz="4" w:space="0" w:color="B9C4D4"/>
+            </w:tcBorders>
+            <w:vAlign w:val="center"/>
+          </w:tcPr>
+          <w:p>
+            <w:r/>
+            <w:r>
+              <w:rPr>
+                <w:rFonts w:ascii="Calibri" w:hAnsi="Calibri"/>
+                <w:b w:val="0"/>
+                <w:i w:val="0"/>
+                <w:color w:val="222222"/>
+                <w:sz w:val="19"/>
+              </w:rPr>
+              <w:t>BO-02</w:t>
+            </w:r>
+          </w:p>
+        </w:tc>
+        <w:tc>
+          <w:tcPr>
+            <w:tcW w:type="dxa" w:w="1134"/>
+            <w:shd w:val="clear" w:color="auto" w:fill="EEF2F7"/>
+            <w:tcBorders>
+              <w:top w:val="single" w:sz="4" w:space="0" w:color="B9C4D4"/>
+              <w:left w:val="single" w:sz="4" w:space="0" w:color="B9C4D4"/>
+              <w:bottom w:val="single" w:sz="4" w:space="0" w:color="B9C4D4"/>
+              <w:right w:val="single" w:sz="4" w:space="0" w:color="B9C4D4"/>
+            </w:tcBorders>
+            <w:vAlign w:val="center"/>
+          </w:tcPr>
+          <w:p>
+            <w:r/>
+            <w:r>
+              <w:rPr>
+                <w:rFonts w:ascii="Calibri" w:hAnsi="Calibri"/>
+                <w:b w:val="0"/>
+                <w:i w:val="0"/>
+                <w:color w:val="222222"/>
+                <w:sz w:val="19"/>
+              </w:rPr>
+              <w:t>Must</w:t>
+            </w:r>
+          </w:p>
+        </w:tc>
+      </w:tr>
+      <w:tr>
+        <w:tc>
+          <w:tcPr>
+            <w:tcW w:type="dxa" w:w="907"/>
+            <w:shd w:val="clear" w:color="auto" w:fill="FFFFFF"/>
+            <w:tcBorders>
+              <w:top w:val="single" w:sz="4" w:space="0" w:color="B9C4D4"/>
+              <w:left w:val="single" w:sz="4" w:space="0" w:color="B9C4D4"/>
+              <w:bottom w:val="single" w:sz="4" w:space="0" w:color="B9C4D4"/>
+              <w:right w:val="single" w:sz="4" w:space="0" w:color="B9C4D4"/>
+            </w:tcBorders>
+            <w:vAlign w:val="center"/>
+          </w:tcPr>
+          <w:p>
+            <w:r/>
+            <w:r>
+              <w:rPr>
+                <w:rFonts w:ascii="Calibri" w:hAnsi="Calibri"/>
+                <w:b/>
+                <w:i w:val="0"/>
+                <w:color w:val="1B365D"/>
+                <w:sz w:val="19"/>
+              </w:rPr>
+              <w:t>BR-15</w:t>
+            </w:r>
+          </w:p>
+        </w:tc>
+        <w:tc>
+          <w:tcPr>
+            <w:tcW w:type="dxa" w:w="5102"/>
+            <w:shd w:val="clear" w:color="auto" w:fill="FFFFFF"/>
+            <w:tcBorders>
+              <w:top w:val="single" w:sz="4" w:space="0" w:color="B9C4D4"/>
+              <w:left w:val="single" w:sz="4" w:space="0" w:color="B9C4D4"/>
+              <w:bottom w:val="single" w:sz="4" w:space="0" w:color="B9C4D4"/>
+              <w:right w:val="single" w:sz="4" w:space="0" w:color="B9C4D4"/>
+            </w:tcBorders>
+            <w:vAlign w:val="center"/>
+          </w:tcPr>
+          <w:p>
+            <w:r/>
+            <w:r>
+              <w:rPr>
+                <w:rFonts w:ascii="Calibri" w:hAnsi="Calibri"/>
+                <w:b w:val="0"/>
+                <w:i w:val="0"/>
+                <w:color w:val="222222"/>
+                <w:sz w:val="19"/>
+              </w:rPr>
+              <w:t>Hệ thống nên cho phép khách hàng đánh giá (số sao) và nhận xét sản phẩm đã mua/thuê, hiển thị điểm trung bình cho sản phẩm đó.</w:t>
+            </w:r>
+          </w:p>
+        </w:tc>
+        <w:tc>
+          <w:tcPr>
+            <w:tcW w:type="dxa" w:w="1361"/>
+            <w:shd w:val="clear" w:color="auto" w:fill="FFFFFF"/>
+            <w:tcBorders>
+              <w:top w:val="single" w:sz="4" w:space="0" w:color="B9C4D4"/>
+              <w:left w:val="single" w:sz="4" w:space="0" w:color="B9C4D4"/>
+              <w:bottom w:val="single" w:sz="4" w:space="0" w:color="B9C4D4"/>
+              <w:right w:val="single" w:sz="4" w:space="0" w:color="B9C4D4"/>
+            </w:tcBorders>
+            <w:vAlign w:val="center"/>
+          </w:tcPr>
+          <w:p>
+            <w:r/>
+            <w:r>
+              <w:rPr>
+                <w:rFonts w:ascii="Calibri" w:hAnsi="Calibri"/>
+                <w:b w:val="0"/>
+                <w:i w:val="0"/>
+                <w:color w:val="222222"/>
+                <w:sz w:val="19"/>
+              </w:rPr>
+              <w:t>BO-04</w:t>
+            </w:r>
+          </w:p>
+        </w:tc>
+        <w:tc>
+          <w:tcPr>
+            <w:tcW w:type="dxa" w:w="1134"/>
+            <w:shd w:val="clear" w:color="auto" w:fill="FFFFFF"/>
+            <w:tcBorders>
+              <w:top w:val="single" w:sz="4" w:space="0" w:color="B9C4D4"/>
+              <w:left w:val="single" w:sz="4" w:space="0" w:color="B9C4D4"/>
+              <w:bottom w:val="single" w:sz="4" w:space="0" w:color="B9C4D4"/>
+              <w:right w:val="single" w:sz="4" w:space="0" w:color="B9C4D4"/>
+            </w:tcBorders>
+            <w:vAlign w:val="center"/>
+          </w:tcPr>
+          <w:p>
+            <w:r/>
+            <w:r>
+              <w:rPr>
+                <w:rFonts w:ascii="Calibri" w:hAnsi="Calibri"/>
+                <w:b w:val="0"/>
+                <w:i w:val="0"/>
+                <w:color w:val="222222"/>
+                <w:sz w:val="19"/>
+              </w:rPr>
+              <w:t>Should</w:t>
+            </w:r>
+          </w:p>
+        </w:tc>
+      </w:tr>
+      <w:tr>
+        <w:tc>
+          <w:tcPr>
+            <w:tcW w:type="dxa" w:w="907"/>
+            <w:shd w:val="clear" w:color="auto" w:fill="EEF2F7"/>
+            <w:tcBorders>
+              <w:top w:val="single" w:sz="4" w:space="0" w:color="B9C4D4"/>
+              <w:left w:val="single" w:sz="4" w:space="0" w:color="B9C4D4"/>
+              <w:bottom w:val="single" w:sz="4" w:space="0" w:color="B9C4D4"/>
+              <w:right w:val="single" w:sz="4" w:space="0" w:color="B9C4D4"/>
+            </w:tcBorders>
+            <w:vAlign w:val="center"/>
+          </w:tcPr>
+          <w:p>
+            <w:r/>
+            <w:r>
+              <w:rPr>
+                <w:rFonts w:ascii="Calibri" w:hAnsi="Calibri"/>
+                <w:b/>
+                <w:i w:val="0"/>
+                <w:color w:val="1B365D"/>
+                <w:sz w:val="19"/>
+              </w:rPr>
+              <w:t>BR-16</w:t>
+            </w:r>
+          </w:p>
+        </w:tc>
+        <w:tc>
+          <w:tcPr>
+            <w:tcW w:type="dxa" w:w="5102"/>
+            <w:shd w:val="clear" w:color="auto" w:fill="EEF2F7"/>
+            <w:tcBorders>
+              <w:top w:val="single" w:sz="4" w:space="0" w:color="B9C4D4"/>
+              <w:left w:val="single" w:sz="4" w:space="0" w:color="B9C4D4"/>
+              <w:bottom w:val="single" w:sz="4" w:space="0" w:color="B9C4D4"/>
+              <w:right w:val="single" w:sz="4" w:space="0" w:color="B9C4D4"/>
+            </w:tcBorders>
+            <w:vAlign w:val="center"/>
+          </w:tcPr>
+          <w:p>
+            <w:r/>
+            <w:r>
+              <w:rPr>
+                <w:rFonts w:ascii="Calibri" w:hAnsi="Calibri"/>
+                <w:b w:val="0"/>
+                <w:i w:val="0"/>
+                <w:color w:val="222222"/>
+                <w:sz w:val="19"/>
+              </w:rPr>
+              <w:t>Hệ thống phải cho phép khách hàng rút tiền từ ví điện tử nội bộ về tài khoản ngân hàng của chính mình.</w:t>
+            </w:r>
+          </w:p>
+        </w:tc>
+        <w:tc>
+          <w:tcPr>
+            <w:tcW w:type="dxa" w:w="1361"/>
+            <w:shd w:val="clear" w:color="auto" w:fill="EEF2F7"/>
+            <w:tcBorders>
+              <w:top w:val="single" w:sz="4" w:space="0" w:color="B9C4D4"/>
+              <w:left w:val="single" w:sz="4" w:space="0" w:color="B9C4D4"/>
+              <w:bottom w:val="single" w:sz="4" w:space="0" w:color="B9C4D4"/>
+              <w:right w:val="single" w:sz="4" w:space="0" w:color="B9C4D4"/>
+            </w:tcBorders>
+            <w:vAlign w:val="center"/>
+          </w:tcPr>
+          <w:p>
+            <w:r/>
+            <w:r>
+              <w:rPr>
+                <w:rFonts w:ascii="Calibri" w:hAnsi="Calibri"/>
+                <w:b w:val="0"/>
+                <w:i w:val="0"/>
+                <w:color w:val="222222"/>
+                <w:sz w:val="19"/>
+              </w:rPr>
+              <w:t>BO-05</w:t>
             </w:r>
           </w:p>
         </w:tc>
@@ -12361,7 +13782,7 @@
           <w:color w:val="222222"/>
           <w:sz w:val="21"/>
         </w:rPr>
-        <w:t>Nếu khách đặt thuê một sản phẩm thì hệ thống phải thu cọc trước khi xuất kho, với số tiền cọc = giá niêm yết bán của sản phẩm (100%) + phí giao vận theo BRU-05 (nếu khách chọn giao vận ở chiều nhận hàng) × 2 (dự trù cho cả chiều nhận và chiều trả); nếu khách chọn tự đến lấy ở chiều nhận hàng thì cọc = giá niêm yết, không cộng phí ship. Chênh lệch phí ship giữa số đã giữ cọc và số thực tế phát sinh ở chiều trả hàng được điều chỉnh (hoàn thêm hoặc thu thêm) khi quyết toán hoàn cọc, cùng lúc với phạt trễ hạn (BRU-03) và đền bù (BRU-04) nếu có.</w:t>
+        <w:t>Nếu khách đặt thuê một sản phẩm thì hệ thống phải thu cọc trước khi xuất kho, với số tiền cọc = giá niêm yết bán của sản phẩm (100%) + phí giao vận ước tính theo BRU-05 cho chiều giao hàng đến khách × 2 (dự trù cho cả chiều giao và chiều lấy hàng trả, vì cả hai chiều đều bắt buộc qua giao vận — hệ thống không còn hình thức tự đến lấy/tự mang trả). Chênh lệch phí ship giữa số đã giữ cọc và số thực tế phát sinh ở chiều trả hàng (do khoảng cách lấy hàng khác khoảng cách giao hàng, hoặc đổi đối tác giao vận) được điều chỉnh (hoàn thêm hoặc thu thêm) khi quyết toán hoàn cọc, cùng lúc với phạt trễ hạn (BRU-03) và đền bù (BRU-04) nếu có.</w:t>
       </w:r>
     </w:p>
     <w:p>
@@ -12526,7 +13947,7 @@
           <w:color w:val="222222"/>
           <w:sz w:val="21"/>
         </w:rPr>
-        <w:t>BRU-05 – Phí giao vận theo khu vực</w:t>
+        <w:t>BRU-05 – Chọn đối tác và tính phí giao vận theo khoảng cách</w:t>
       </w:r>
     </w:p>
     <w:p>
@@ -12541,7 +13962,7 @@
           <w:color w:val="222222"/>
           <w:sz w:val="21"/>
         </w:rPr>
-        <w:t>Nếu khách chọn hình thức giao vận (ở chiều nhận hàng hoặc chiều trả hàng) thì phí giao vận cho chiều đó được tính theo khu vực giao nhận do đối tác giao vận Green SM (giả định) báo giá qua API tại thời điểm đặt: Nội thành = 20.000 VNĐ, Ngoại thành = 35.000 VNĐ, Ngoài tỉnh = 60.000 VNĐ; nếu khách chọn tự đến lấy/tự mang trả ở chiều đó thì phí giao vận chiều đó bằng 0.</w:t>
+        <w:t>Mỗi chiều giao vận (giao hàng đến khách hoặc lấy hàng trả về kho) đều được hệ thống tự động chọn đối tác dựa trên khoảng cách đường chim bay giữa địa chỉ kho và địa chỉ của khách ở chiều đó: nếu khoảng cách ≤ 20km thì dùng Green SM (giao nhanh trong ngày); nếu &gt; 20km thì dùng Shopee Express (thời gian vận chuyển lâu hơn, thường 1-3 ngày). Phí giao vận của chiều đó do đối tác được chọn báo giá qua API tại thời điểm đặt, dựa trên khoảng cách thực tế; hệ thống không có hình thức tự đến lấy/tự mang trả.</w:t>
       </w:r>
     </w:p>
     <w:p>
@@ -12556,7 +13977,7 @@
           <w:color w:val="444444"/>
           <w:sz w:val="19"/>
         </w:rPr>
-        <w:t>Căn cứ: Chính sách nội bộ chủ đầu tư, báo giá giả định của Green SM  |  Yêu cầu liên quan: BR-09</w:t>
+        <w:t>Căn cứ: Chính sách nội bộ chủ đầu tư, báo giá giả định của Green SM/Shopee Express  |  Yêu cầu liên quan: BR-09</w:t>
       </w:r>
     </w:p>
     <w:p>
@@ -12571,7 +13992,7 @@
           <w:color w:val="222222"/>
           <w:sz w:val="21"/>
         </w:rPr>
-        <w:t>BRU-06 – Thanh toán trực tuyến qua mã QR</w:t>
+        <w:t>BRU-06 – Thanh toán trực tuyến qua mã QR và hoàn tiền vào ví điện tử nội bộ</w:t>
       </w:r>
     </w:p>
     <w:p>
@@ -12586,7 +14007,7 @@
           <w:color w:val="222222"/>
           <w:sz w:val="21"/>
         </w:rPr>
-        <w:t>Nếu khách chọn thanh toán trực tuyến thì hệ thống phải gọi cổng thanh toán MoMo (giả định) để sinh mã QR động gắn với đúng mã đơn và số tiền cần thu (cọc, tiền hàng hoặc tiền còn thiếu khi quyết toán); đơn chỉ được xác nhận là đã thanh toán sau khi hệ thống nhận được webhook xác nhận thành công từ MoMo, không chấp nhận xác nhận thủ công bằng lời khách báo.</w:t>
+        <w:t>Nếu khách chọn thanh toán trực tuyến thì hệ thống phải gọi cổng thanh toán MoMo (giả định) để sinh mã QR động gắn với đúng mã đơn và số tiền cần thu (cọc, tiền hàng hoặc tiền còn thiếu khi quyết toán); đơn chỉ được xác nhận là đã thanh toán sau khi hệ thống nhận được webhook xác nhận thành công từ MoMo, không chấp nhận xác nhận thủ công bằng lời khách báo. Khi cần hoàn tiền cho khách (hoàn cọc, hoàn chênh lệch ship), hệ thống cộng tiền vào Ví điện tử nội bộ của khách trên hệ thống (không hoàn trực tiếp qua MoMo); khách có thể dùng số dư ví để thanh toán cho đơn khác hoặc yêu cầu rút về tài khoản ngân hàng của chính mình (BR-16).</w:t>
       </w:r>
     </w:p>
     <w:p>
@@ -12601,7 +14022,52 @@
           <w:color w:val="444444"/>
           <w:sz w:val="19"/>
         </w:rPr>
-        <w:t>Căn cứ: Chính sách nội bộ chủ đầu tư (giả định)  |  Yêu cầu liên quan: BR-10</w:t>
+        <w:t>Căn cứ: Chính sách nội bộ chủ đầu tư (giả định)  |  Yêu cầu liên quan: BR-10, BR-16</w:t>
+      </w:r>
+    </w:p>
+    <w:p>
+      <w:pPr>
+        <w:spacing w:after="120"/>
+      </w:pPr>
+      <w:r>
+        <w:rPr>
+          <w:rFonts w:ascii="Calibri" w:hAnsi="Calibri"/>
+          <w:b/>
+          <w:i w:val="0"/>
+          <w:color w:val="222222"/>
+          <w:sz w:val="21"/>
+        </w:rPr>
+        <w:t>BRU-07 – Ưu tiên theo thời điểm thanh toán thành công (không giữ chỗ trước)</w:t>
+      </w:r>
+    </w:p>
+    <w:p>
+      <w:pPr>
+        <w:spacing w:after="120"/>
+      </w:pPr>
+      <w:r>
+        <w:rPr>
+          <w:rFonts w:ascii="Calibri" w:hAnsi="Calibri"/>
+          <w:b w:val="0"/>
+          <w:i w:val="0"/>
+          <w:color w:val="222222"/>
+          <w:sz w:val="21"/>
+        </w:rPr>
+        <w:t>Hệ thống không giữ chỗ/khoá tạm sản phẩm khi khách thêm vào giỏ hoặc bắt đầu thanh toán. Khi nhiều khách cùng thanh toán cho cùng một hộp game/khoảng ngày thuê trùng nhau, hệ thống chỉ xác nhận đơn cho khách có webhook thanh toán thành công đến trước (theo đúng thời điểm xử lý tại hệ thống); các khách còn lại nhận thông báo sản phẩm đã được người khác mua/thuê trước và được hoàn tiền ngay vào ví điện tử nội bộ nếu đã trừ tiền.</w:t>
+      </w:r>
+    </w:p>
+    <w:p>
+      <w:pPr>
+        <w:spacing w:after="120"/>
+      </w:pPr>
+      <w:r>
+        <w:rPr>
+          <w:rFonts w:ascii="Calibri" w:hAnsi="Calibri"/>
+          <w:b w:val="0"/>
+          <w:i/>
+          <w:color w:val="444444"/>
+          <w:sz w:val="19"/>
+        </w:rPr>
+        <w:t>Căn cứ: Quyết định của chủ đầu tư (giả định), ưu tiên đơn giản hoá so với giữ chỗ tạm  |  Yêu cầu liên quan: BR-01, BR-05</w:t>
       </w:r>
     </w:p>
     <w:p>
@@ -13090,7 +14556,7 @@
                 <w:color w:val="222222"/>
                 <w:sz w:val="19"/>
               </w:rPr>
-              <w:t>Phí giao vận theo khu vực</w:t>
+              <w:t>Chọn đối tác và tính phí giao vận theo khoảng cách</w:t>
             </w:r>
           </w:p>
         </w:tc>
@@ -13170,7 +14636,7 @@
                 <w:color w:val="222222"/>
                 <w:sz w:val="19"/>
               </w:rPr>
-              <w:t>Thanh toán trực tuyến qua mã QR</w:t>
+              <w:t>Thanh toán trực tuyến qua mã QR và hoàn tiền vào ví điện tử nội bộ</w:t>
             </w:r>
           </w:p>
         </w:tc>
@@ -13196,7 +14662,87 @@
                 <w:color w:val="222222"/>
                 <w:sz w:val="19"/>
               </w:rPr>
-              <w:t>BR-10</w:t>
+              <w:t>BR-10, BR-16</w:t>
+            </w:r>
+          </w:p>
+        </w:tc>
+      </w:tr>
+      <w:tr>
+        <w:tc>
+          <w:tcPr>
+            <w:tcW w:type="dxa" w:w="1134"/>
+            <w:shd w:val="clear" w:color="auto" w:fill="FFFFFF"/>
+            <w:tcBorders>
+              <w:top w:val="single" w:sz="4" w:space="0" w:color="B9C4D4"/>
+              <w:left w:val="single" w:sz="4" w:space="0" w:color="B9C4D4"/>
+              <w:bottom w:val="single" w:sz="4" w:space="0" w:color="B9C4D4"/>
+              <w:right w:val="single" w:sz="4" w:space="0" w:color="B9C4D4"/>
+            </w:tcBorders>
+            <w:vAlign w:val="center"/>
+          </w:tcPr>
+          <w:p>
+            <w:r/>
+            <w:r>
+              <w:rPr>
+                <w:rFonts w:ascii="Calibri" w:hAnsi="Calibri"/>
+                <w:b/>
+                <w:i w:val="0"/>
+                <w:color w:val="1B365D"/>
+                <w:sz w:val="19"/>
+              </w:rPr>
+              <w:t>BRU-07</w:t>
+            </w:r>
+          </w:p>
+        </w:tc>
+        <w:tc>
+          <w:tcPr>
+            <w:tcW w:type="dxa" w:w="3969"/>
+            <w:shd w:val="clear" w:color="auto" w:fill="FFFFFF"/>
+            <w:tcBorders>
+              <w:top w:val="single" w:sz="4" w:space="0" w:color="B9C4D4"/>
+              <w:left w:val="single" w:sz="4" w:space="0" w:color="B9C4D4"/>
+              <w:bottom w:val="single" w:sz="4" w:space="0" w:color="B9C4D4"/>
+              <w:right w:val="single" w:sz="4" w:space="0" w:color="B9C4D4"/>
+            </w:tcBorders>
+            <w:vAlign w:val="center"/>
+          </w:tcPr>
+          <w:p>
+            <w:r/>
+            <w:r>
+              <w:rPr>
+                <w:rFonts w:ascii="Calibri" w:hAnsi="Calibri"/>
+                <w:b w:val="0"/>
+                <w:i w:val="0"/>
+                <w:color w:val="222222"/>
+                <w:sz w:val="19"/>
+              </w:rPr>
+              <w:t>Ưu tiên theo thời điểm thanh toán thành công (không giữ chỗ trước)</w:t>
+            </w:r>
+          </w:p>
+        </w:tc>
+        <w:tc>
+          <w:tcPr>
+            <w:tcW w:type="dxa" w:w="3402"/>
+            <w:shd w:val="clear" w:color="auto" w:fill="FFFFFF"/>
+            <w:tcBorders>
+              <w:top w:val="single" w:sz="4" w:space="0" w:color="B9C4D4"/>
+              <w:left w:val="single" w:sz="4" w:space="0" w:color="B9C4D4"/>
+              <w:bottom w:val="single" w:sz="4" w:space="0" w:color="B9C4D4"/>
+              <w:right w:val="single" w:sz="4" w:space="0" w:color="B9C4D4"/>
+            </w:tcBorders>
+            <w:vAlign w:val="center"/>
+          </w:tcPr>
+          <w:p>
+            <w:r/>
+            <w:r>
+              <w:rPr>
+                <w:rFonts w:ascii="Calibri" w:hAnsi="Calibri"/>
+                <w:b w:val="0"/>
+                <w:i w:val="0"/>
+                <w:color w:val="222222"/>
+                <w:sz w:val="19"/>
+              </w:rPr>
+              <w:t>BR-01, BR-05</w:t>
             </w:r>
           </w:p>
         </w:tc>
@@ -13369,7 +14915,7 @@
                 <w:color w:val="222222"/>
                 <w:sz w:val="19"/>
               </w:rPr>
-              <w:t>Xem sản phẩm, đặt mua/đặt thuê, chọn hình thức nhận/trả hàng, thanh toán online, theo dõi đơn, nhận hoàn cọc đúng hạn.</w:t>
+              <w:t>Xem sản phẩm, đặt mua/đặt thuê, thanh toán online, theo dõi giao vận hai chiều, đánh giá sản phẩm, quản lý hồ sơ và ví điện tử, nhận hoàn cọc đúng hạn.</w:t>
             </w:r>
           </w:p>
         </w:tc>
@@ -13395,7 +14941,7 @@
                 <w:color w:val="222222"/>
                 <w:sz w:val="19"/>
               </w:rPr>
-              <w:t>BR-01, BR-02, BR-08, BR-09, BR-10</w:t>
+              <w:t>BR-01, BR-02, BR-08, BR-09, BR-10, BR-14, BR-15, BR-16</w:t>
             </w:r>
           </w:p>
         </w:tc>
@@ -13423,7 +14969,7 @@
                 <w:color w:val="222222"/>
                 <w:sz w:val="19"/>
               </w:rPr>
-              <w:t>Nhân viên kho/quầy</w:t>
+              <w:t>Nhân viên kho/xử lý đơn hàng</w:t>
             </w:r>
           </w:p>
         </w:tc>
@@ -13449,7 +14995,7 @@
                 <w:color w:val="222222"/>
                 <w:sz w:val="19"/>
               </w:rPr>
-              <w:t>Xác nhận đơn, kiểm đếm linh kiện, xuất/nhập kho nhanh và chính xác.</w:t>
+              <w:t>Xác nhận đơn, kiểm đếm linh kiện, xuất/nhập kho nhanh và chính xác, bàn giao cho đối tác giao vận.</w:t>
             </w:r>
           </w:p>
         </w:tc>
@@ -13529,7 +15075,7 @@
                 <w:color w:val="222222"/>
                 <w:sz w:val="19"/>
               </w:rPr>
-              <w:t>Xem báo cáo, quản lý danh mục sản phẩm và giá, theo dõi tồn kho.</w:t>
+              <w:t>Đăng nhập riêng, quản lý tài khoản nhân viên, quản lý danh mục sản phẩm và giá, xem báo cáo, theo dõi tồn kho.</w:t>
             </w:r>
           </w:p>
         </w:tc>
@@ -13555,7 +15101,7 @@
                 <w:color w:val="222222"/>
                 <w:sz w:val="19"/>
               </w:rPr>
-              <w:t>BR-07</w:t>
+              <w:t>BR-07, BR-11, BR-12, BR-13</w:t>
             </w:r>
           </w:p>
         </w:tc>
@@ -13752,7 +15298,7 @@
                 <w:color w:val="222222"/>
                 <w:sz w:val="19"/>
               </w:rPr>
-              <w:t>Thông tin tài khoản và lịch sử giao dịch của khách phải được bảo vệ, chỉ chủ tài khoản và Admin truy cập được.</w:t>
+              <w:t>Thông tin tài khoản, ví điện tử và lịch sử giao dịch của khách phải được bảo vệ, chỉ chủ tài khoản và Admin truy cập được.</w:t>
             </w:r>
           </w:p>
         </w:tc>
@@ -13806,7 +15352,7 @@
                 <w:color w:val="222222"/>
                 <w:sz w:val="19"/>
               </w:rPr>
-              <w:t>Nhân viên quầy mới phải thao tác được luồng tạo đơn thuê cơ bản sau tối đa 30 phút hướng dẫn.</w:t>
+              <w:t>Nhân viên mới phải thao tác được luồng xác nhận đơn thuê cơ bản sau tối đa 30 phút hướng dẫn.</w:t>
             </w:r>
           </w:p>
         </w:tc>
@@ -14115,7 +15661,7 @@
                 <w:color w:val="222222"/>
                 <w:sz w:val="19"/>
               </w:rPr>
-              <w:t>Đào tạo 4 nhân viên kho/quầy và 1 Admin sử dụng hệ thống.</w:t>
+              <w:t>Đào tạo 5 nhân viên kho/xử lý đơn hàng và 1 Admin sử dụng hệ thống.</w:t>
             </w:r>
           </w:p>
         </w:tc>
@@ -16477,7 +18023,7 @@
                 <w:color w:val="222222"/>
                 <w:sz w:val="19"/>
               </w:rPr>
-              <w:t>Khách hàng không quen đặt thuê online, vẫn gọi điện/nhắn Zalo như cũ.</w:t>
+              <w:t>Khách hàng không quen tự đặt thuê trên website, vẫn gọi điện/nhắn Zalo cho nhân viên hỗ trợ đặt hộ như cũ.</w:t>
             </w:r>
           </w:p>
         </w:tc>
@@ -16555,7 +18101,7 @@
                 <w:color w:val="222222"/>
                 <w:sz w:val="19"/>
               </w:rPr>
-              <w:t>Ưu đãi nhỏ cho đơn đặt online trong tháng đầu, hướng dẫn trực tiếp tại quầy.</w:t>
+              <w:t>Ưu đãi nhỏ cho đơn khách tự đặt online trong tháng đầu, nhân viên hỗ trợ trực tuyến hướng dẫn khách qua điện thoại/chat.</w:t>
             </w:r>
           </w:p>
         </w:tc>
@@ -16883,7 +18429,7 @@
           <w:color w:val="222222"/>
           <w:sz w:val="21"/>
         </w:rPr>
-        <w:t>RISK-02: Khách hàng không quen đặt thuê online, vẫn gọi điện/nhắn Zalo như cũ.</w:t>
+        <w:t>RISK-02: Khách hàng không quen tự đặt thuê trên website, vẫn gọi điện/nhắn Zalo cho nhân viên hỗ trợ đặt hộ như cũ.</w:t>
       </w:r>
     </w:p>
     <w:p>
@@ -16898,7 +18444,7 @@
           <w:color w:val="222222"/>
           <w:sz w:val="21"/>
         </w:rPr>
-        <w:t>Dấu hiệu nhận biết: tỷ lệ/ số vụ liên quan tăng bất thường so với baseline ở Chương 4. Hành động: Ưu đãi nhỏ cho đơn đặt online trong tháng đầu, hướng dẫn trực tiếp tại quầy. Người quyết định: Quản lý vận hành.</w:t>
+        <w:t>Dấu hiệu nhận biết: tỷ lệ/ số vụ liên quan tăng bất thường so với baseline ở Chương 4. Hành động: Ưu đãi nhỏ cho đơn khách tự đặt online trong tháng đầu, nhân viên hỗ trợ trực tuyến hướng dẫn khách qua điện thoại/chat. Người quyết định: Quản lý vận hành.</w:t>
       </w:r>
     </w:p>
     <w:p>
@@ -18236,7 +19782,7 @@
           <w:color w:val="222222"/>
           <w:sz w:val="21"/>
         </w:rPr>
-        <w:t>Áp dụng chiến lược giao tiếp theo từng nhóm bên liên quan (Chương 6): báo cáo tiến độ hàng tuần cho Chủ đầu tư/Quản lý vận hành; tổ chức 1 buổi đào tạo trực tiếp cho nhân viên kho/quầy trước go-live; thông báo thay đổi chính sách giá cho khách qua trang web.</w:t>
+        <w:t>Áp dụng chiến lược giao tiếp theo từng nhóm bên liên quan (Chương 6): báo cáo tiến độ hàng tuần cho Chủ đầu tư/Quản lý vận hành; tổ chức 1 buổi đào tạo trực tiếp cho nhân viên kho/xử lý đơn hàng trước go-live; thông báo thay đổi chính sách giá cho khách qua trang web.</w:t>
       </w:r>
     </w:p>
     <w:p>
@@ -18606,7 +20152,7 @@
                 <w:color w:val="222222"/>
                 <w:sz w:val="19"/>
               </w:rPr>
-              <w:t>Nhân viên kho/quầy</w:t>
+              <w:t>Nhân viên kho/xử lý đơn hàng</w:t>
             </w:r>
           </w:p>
         </w:tc>
@@ -18634,7 +20180,7 @@
                 <w:color w:val="222222"/>
                 <w:sz w:val="19"/>
               </w:rPr>
-              <w:t>Hệ thống tính đúng phí giao vận theo khu vực (BRU-05) và số tiền cọc có cộng ship (BRU-01) trên tối thiểu 6 kịch bản kiểm thử</w:t>
+              <w:t>Hệ thống tính đúng phí giao vận theo khoảng cách và chọn đúng đối tác theo bán kính 20km (BRU-05), số tiền cọc có cộng ship (BRU-01) trên tối thiểu 6 kịch bản kiểm thử</w:t>
             </w:r>
           </w:p>
         </w:tc>
@@ -18794,7 +20340,7 @@
                 <w:color w:val="222222"/>
                 <w:sz w:val="19"/>
               </w:rPr>
-              <w:t>Thời gian xử lý 1 đơn thuê mẫu tại quầy ≤ 3 phút</w:t>
+              <w:t>Thời gian xử lý 1 đơn thuê mẫu từ lúc khách đặt đến lúc nhân viên xác nhận ≤ 3 phút</w:t>
             </w:r>
           </w:p>
         </w:tc>
@@ -19594,7 +21140,7 @@
                 <w:color w:val="222222"/>
                 <w:sz w:val="19"/>
               </w:rPr>
-              <w:t>BR-01, BR-05, BR-08, BR-09, BR-10</w:t>
+              <w:t>BR-01, BR-05, BR-08, BR-09, BR-10, BR-14</w:t>
             </w:r>
           </w:p>
         </w:tc>
@@ -19648,7 +21194,7 @@
                 <w:color w:val="222222"/>
                 <w:sz w:val="19"/>
               </w:rPr>
-              <w:t>BR-02, BR-05</w:t>
+              <w:t>BR-02, BR-05, BR-11</w:t>
             </w:r>
           </w:p>
         </w:tc>
@@ -19702,7 +21248,7 @@
                 <w:color w:val="222222"/>
                 <w:sz w:val="19"/>
               </w:rPr>
-              <w:t>BR-07, BR-09</w:t>
+              <w:t>BR-07, BR-09, BR-12, BR-13, BR-15</w:t>
             </w:r>
           </w:p>
         </w:tc>
@@ -19756,7 +21302,7 @@
                 <w:color w:val="222222"/>
                 <w:sz w:val="19"/>
               </w:rPr>
-              <w:t>BR-02, BR-04, BR-10</w:t>
+              <w:t>BR-02, BR-04, BR-10, BR-13, BR-16</w:t>
             </w:r>
           </w:p>
         </w:tc>

</xml_diff>